<commit_message>
Remove outdated content and update Bible resource files for 2026 release
</commit_message>
<xml_diff>
--- a/eng/docx/41.content.docx
+++ b/eng/docx/41.content.docx
@@ -6690,7 +6690,7 @@
         <w:rPr>
           <w:lang w:val="en_US" w:bidi="en_US"/>
         </w:rPr>
-        <w:t>This controversy centers on Jesus’ befriending disreputable sinners such as tax collectors and eating with them.</w:t>
+        <w:t>This controversy is about Jesus spending time with sinners who had a bad reputation, such as tax collectors, and eating with them.</w:t>
       </w:r>
       <w:r>
         <w:rPr>
@@ -6738,7 +6738,7 @@
         <w:rPr>
           <w:lang w:val="en_US" w:bidi="en_US"/>
         </w:rPr>
-        <w:t>The teachers of religious law who were Pharisees understood Jesus’ act of eating with sinners as intentionally accepting them as friends (</w:t>
+        <w:t>The Pharisees, who were teachers of religious law, regarded Jesus eating with sinners as him accepting them as friends (</w:t>
       </w:r>
       <w:hyperlink r:id="rId206">
         <w:r>
@@ -6821,14 +6821,28 @@
             <w:color w:val="0000EE"/>
             <w:u w:val="single"/>
           </w:rPr>
-          <w:t>Gal 2:11–12</w:t>
-        </w:r>
-      </w:hyperlink>
-      <w:r>
-        <w:rPr>
-          <w:lang w:val="en_US" w:bidi="en_US"/>
-        </w:rPr>
-        <w:t>). Jesus indicated that these tax collectors and sinners were invited to share in the Kingdom of God. In Jesus’ ministry, even Gentiles were invited to share the Kingdom (</w:t>
+          <w:t>Galatians 2:11–12</w:t>
+        </w:r>
+      </w:hyperlink>
+      <w:r>
+        <w:rPr>
+          <w:lang w:val="en_US" w:bidi="en_US"/>
+        </w:rPr>
+        <w:t xml:space="preserve">). Jesus showed that these tax collectors and sinners were welcome in the kingdom of God. </w:t>
+      </w:r>
+    </w:p>
+    <w:p>
+      <w:pPr/>
+      <w:r>
+        <w:rPr>
+          <w:lang w:val="en_US" w:bidi="en_US"/>
+        </w:rPr>
+      </w:r>
+      <w:r>
+        <w:rPr>
+          <w:lang w:val="en_US" w:bidi="en_US"/>
+        </w:rPr>
+        <w:t>In his ministry, Jesus invited both Jews and Gentiles to share in the kingdom of God (</w:t>
       </w:r>
       <w:hyperlink r:id="rId76">
         <w:r>
@@ -6864,7 +6878,7 @@
         <w:rPr>
           <w:lang w:val="en_US" w:bidi="en_US"/>
         </w:rPr>
-        <w:t xml:space="preserve">; cp. </w:t>
+        <w:t xml:space="preserve">; compare </w:t>
       </w:r>
       <w:hyperlink r:id="rId211">
         <w:r>
@@ -6875,7 +6889,7 @@
             <w:color w:val="0000EE"/>
             <w:u w:val="single"/>
           </w:rPr>
-          <w:t>Matt 8:5–13</w:t>
+          <w:t>Matthew 8:5–13</w:t>
         </w:r>
       </w:hyperlink>
       <w:r>
@@ -6966,7 +6980,7 @@
         <w:rPr>
           <w:lang w:val="en_US" w:bidi="en_US"/>
         </w:rPr>
-        <w:t>Jesus answered his opponents with a well-known proverb, comparing himself to a doctor and sinners to sick people. Salvation is for those who know they are sinners, not those who think they are righteous (</w:t>
+        <w:t>Jesus answered his opponents with a well-known proverb. He compared himself to a doctor and sinners to sick people. Salvation is for those who know they are sinners, not for those who think they are righteous (</w:t>
       </w:r>
       <w:hyperlink r:id="rId214">
         <w:r>
@@ -7013,7 +7027,7 @@
             <w:color w:val="0000EE"/>
             <w:u w:val="single"/>
           </w:rPr>
-          <w:t>Rom 3:23</w:t>
+          <w:t>Romans 3:23</w:t>
         </w:r>
       </w:hyperlink>
       <w:r>
@@ -7099,7 +7113,7 @@
         <w:rPr>
           <w:lang w:val="en_US" w:bidi="en_US"/>
         </w:rPr>
-        <w:t>), and Jews often fasted when mourning or specially seeking the Lord’s favor (</w:t>
+        <w:t>). Jews often fasted when mourning or specially seeking the Lord's favor (</w:t>
       </w:r>
       <w:hyperlink r:id="rId218">
         <w:r>
@@ -7110,7 +7124,7 @@
             <w:color w:val="0000EE"/>
             <w:u w:val="single"/>
           </w:rPr>
-          <w:t>Lev 16:29–31</w:t>
+          <w:t>Leviticus 16:29–31</w:t>
         </w:r>
       </w:hyperlink>
       <w:r>
@@ -7128,7 +7142,7 @@
             <w:color w:val="0000EE"/>
             <w:u w:val="single"/>
           </w:rPr>
-          <w:t>1 Sam 31:13</w:t>
+          <w:t>1 Samuel 31:13</w:t>
         </w:r>
       </w:hyperlink>
       <w:r>
@@ -7146,7 +7160,7 @@
             <w:color w:val="0000EE"/>
             <w:u w:val="single"/>
           </w:rPr>
-          <w:t>2 Sam 1:12</w:t>
+          <w:t>2 Samuel 1:12</w:t>
         </w:r>
       </w:hyperlink>
       <w:r>
@@ -7200,7 +7214,7 @@
             <w:color w:val="0000EE"/>
             <w:u w:val="single"/>
           </w:rPr>
-          <w:t>Esth 4:3</w:t>
+          <w:t>Esther 4:3</w:t>
         </w:r>
       </w:hyperlink>
       <w:r>
@@ -7218,7 +7232,7 @@
             <w:color w:val="0000EE"/>
             <w:u w:val="single"/>
           </w:rPr>
-          <w:t>Matt 6:16</w:t>
+          <w:t>Matthew 6:16</w:t>
         </w:r>
       </w:hyperlink>
       <w:r>
@@ -7273,7 +7287,20 @@
         <w:rPr>
           <w:lang w:val="en_US" w:bidi="en_US"/>
         </w:rPr>
-        <w:t>Jesus was like a groom at his wedding, so fasting was inappropriate. It was a time for celebration (</w:t>
+        <w:t xml:space="preserve">Jesus was like a </w:t>
+      </w:r>
+      <w:r>
+        <w:rPr>
+          <w:i/>
+          <w:lang w:val="en_US" w:bidi="en_US"/>
+        </w:rPr>
+        <w:t>bridegroom</w:t>
+      </w:r>
+      <w:r>
+        <w:rPr>
+          <w:lang w:val="en_US" w:bidi="en_US"/>
+        </w:rPr>
+        <w:t xml:space="preserve"> at his wedding, so fasting was not appropriate. It was a time to celebrate (</w:t>
       </w:r>
       <w:hyperlink r:id="rId225">
         <w:r>
@@ -7309,7 +7336,7 @@
         <w:rPr>
           <w:lang w:val="en_US" w:bidi="en_US"/>
         </w:rPr>
-        <w:t xml:space="preserve">). The disciples would fast when Jesus was taken away by death (see </w:t>
+        <w:t xml:space="preserve">). The disciples would fast after Jesus went up to heaven (see </w:t>
       </w:r>
       <w:hyperlink r:id="rId227">
         <w:r>
@@ -7393,7 +7420,46 @@
         <w:rPr>
           <w:lang w:val="en_US" w:bidi="en_US"/>
         </w:rPr>
-        <w:t>Old customs of the old covenant are incompatible with the new arrival of God’s Kingdom. Common experience shows that an unshrunken new patch sewn on old clothing will tear the old cloth as it shrinks. Similarly, brittle old wineskins will burst when new wine ferments in them. Jesus’ meaning was that the fasting of the old cannot mix with the feasting of the new.</w:t>
+        <w:t xml:space="preserve">The old customs of the old covenant do not fit with the new arrival of God's kingdom. People know that a </w:t>
+      </w:r>
+      <w:r>
+        <w:rPr>
+          <w:i/>
+          <w:lang w:val="en_US" w:bidi="en_US"/>
+        </w:rPr>
+        <w:t>patch of unshrunk</w:t>
+      </w:r>
+      <w:r>
+        <w:rPr>
+          <w:lang w:val="en_US" w:bidi="en_US"/>
+        </w:rPr>
+        <w:t xml:space="preserve"> </w:t>
+      </w:r>
+      <w:r>
+        <w:rPr>
+          <w:i/>
+          <w:lang w:val="en_US" w:bidi="en_US"/>
+        </w:rPr>
+        <w:t xml:space="preserve">cloth </w:t>
+      </w:r>
+      <w:r>
+        <w:rPr>
+          <w:lang w:val="en_US" w:bidi="en_US"/>
+        </w:rPr>
+        <w:t xml:space="preserve">sewn on old clothing will tear the old cloth as it shrinks. In the same way, cracking </w:t>
+      </w:r>
+      <w:r>
+        <w:rPr>
+          <w:i/>
+          <w:lang w:val="en_US" w:bidi="en_US"/>
+        </w:rPr>
+        <w:t>old wineskins</w:t>
+      </w:r>
+      <w:r>
+        <w:rPr>
+          <w:lang w:val="en_US" w:bidi="en_US"/>
+        </w:rPr>
+        <w:t xml:space="preserve"> will burst when new wine ferments in them. The fasting of the old ways cannot be mixed with the feasting that comes with the new.</w:t>
       </w:r>
       <w:r>
         <w:rPr>
@@ -8442,20 +8508,7 @@
         <w:rPr>
           <w:lang w:val="en_US" w:bidi="en_US"/>
         </w:rPr>
-        <w:t>Jesus healed many people that day</w:t>
-      </w:r>
-      <w:r>
-        <w:rPr>
-          <w:i/>
-          <w:lang w:val="en_US" w:bidi="en_US"/>
-        </w:rPr>
-        <w:t>;</w:t>
-      </w:r>
-      <w:r>
-        <w:rPr>
-          <w:lang w:val="en_US" w:bidi="en_US"/>
-        </w:rPr>
-        <w:t xml:space="preserve"> perhaps he healed all the sick (cp. </w:t>
+        <w:t xml:space="preserve">Jesus healed many people that day. He might have healed all the sick (see </w:t>
       </w:r>
       <w:hyperlink r:id="rId251">
         <w:r>
@@ -8466,7 +8519,7 @@
             <w:color w:val="0000EE"/>
             <w:u w:val="single"/>
           </w:rPr>
-          <w:t>Matt 12:15</w:t>
+          <w:t>Matthew 12:15</w:t>
         </w:r>
       </w:hyperlink>
       <w:r>
@@ -8521,7 +8574,20 @@
         <w:rPr>
           <w:lang w:val="en_US" w:bidi="en_US"/>
         </w:rPr>
-        <w:t>The evil spirits knew who Jesus was (</w:t>
+        <w:t>The</w:t>
+      </w:r>
+      <w:r>
+        <w:rPr>
+          <w:i/>
+          <w:lang w:val="en_US" w:bidi="en_US"/>
+        </w:rPr>
+        <w:t xml:space="preserve"> unclean spirits </w:t>
+      </w:r>
+      <w:r>
+        <w:rPr>
+          <w:lang w:val="en_US" w:bidi="en_US"/>
+        </w:rPr>
+        <w:t>knew who Jesus was (</w:t>
       </w:r>
       <w:hyperlink r:id="rId108">
         <w:r>
@@ -8575,7 +8641,7 @@
         <w:rPr>
           <w:lang w:val="en_US" w:bidi="en_US"/>
         </w:rPr>
-        <w:t>), but Jesus did not want his identity revealed.</w:t>
+        <w:t>). But Jesus did not want people to know his identity.</w:t>
       </w:r>
       <w:r>
         <w:rPr>
@@ -8623,7 +8689,7 @@
         <w:rPr>
           <w:lang w:val="en_US" w:bidi="en_US"/>
         </w:rPr>
-        <w:t>The scene now changes to a mountain, and Mark tells how Jesus called his disciples, which is reminiscent of God’s call of Old Testament prophets (</w:t>
+        <w:t>The scene shifts to a mountain. Mark describes how Jesus called his disciples to come to him. This is similar to God's call to Old Testament prophets (</w:t>
       </w:r>
       <w:hyperlink r:id="rId252">
         <w:r>
@@ -8634,7 +8700,7 @@
             <w:color w:val="0000EE"/>
             <w:u w:val="single"/>
           </w:rPr>
-          <w:t>Exod 3:14–22</w:t>
+          <w:t>Exodus 3:14–22</w:t>
         </w:r>
       </w:hyperlink>
       <w:r>
@@ -8652,7 +8718,7 @@
             <w:color w:val="0000EE"/>
             <w:u w:val="single"/>
           </w:rPr>
-          <w:t>1 Sam 3:4–14</w:t>
+          <w:t>1 Samuel 3:4–14</w:t>
         </w:r>
       </w:hyperlink>
       <w:r>
@@ -8670,7 +8736,7 @@
             <w:color w:val="0000EE"/>
             <w:u w:val="single"/>
           </w:rPr>
-          <w:t>Jer 1:5–19</w:t>
+          <w:t>Jeremiah 1:5–19</w:t>
         </w:r>
       </w:hyperlink>
       <w:r>
@@ -8725,7 +8791,59 @@
         <w:rPr>
           <w:lang w:val="en_US" w:bidi="en_US"/>
         </w:rPr>
-        <w:t>Jesus appointed twelve to represent Israel’s twelve tribes and to proclaim that the Kingdom of God had arrived. He called them apostles (Greek apostoloi, “emissaries”). He chose them to accompany him and to be sent out (Greek apostellō) to preach and to cast out demons. They represented Jesus and were endowed with his authority.</w:t>
+        <w:t xml:space="preserve">Jesus chose 12 men to represent Israel's 12 tribes and to announce that the kingdom of God had arrived. He called them apostles. The Greek word </w:t>
+      </w:r>
+      <w:r>
+        <w:rPr>
+          <w:i/>
+          <w:lang w:val="en_US" w:bidi="en_US"/>
+        </w:rPr>
+        <w:t>apostoloi</w:t>
+      </w:r>
+      <w:r>
+        <w:rPr>
+          <w:lang w:val="en_US" w:bidi="en_US"/>
+        </w:rPr>
+        <w:t xml:space="preserve"> refers to </w:t>
+      </w:r>
+      <w:r>
+        <w:rPr>
+          <w:lang w:val="en_US" w:bidi="en_US"/>
+        </w:rPr>
+        <w:t>people sent on a special mission.</w:t>
+      </w:r>
+      <w:r>
+        <w:rPr>
+          <w:lang w:val="en_US" w:bidi="en_US"/>
+        </w:rPr>
+        <w:t xml:space="preserve"> </w:t>
+      </w:r>
+    </w:p>
+    <w:p>
+      <w:pPr/>
+      <w:r>
+        <w:rPr>
+          <w:lang w:val="en_US" w:bidi="en_US"/>
+        </w:rPr>
+      </w:r>
+      <w:r>
+        <w:rPr>
+          <w:lang w:val="en_US" w:bidi="en_US"/>
+        </w:rPr>
+        <w:t xml:space="preserve">Jesus chose them to travel with him and to be sent out (Greek </w:t>
+      </w:r>
+      <w:r>
+        <w:rPr>
+          <w:i/>
+          <w:lang w:val="en_US" w:bidi="en_US"/>
+        </w:rPr>
+        <w:t>apostellō</w:t>
+      </w:r>
+      <w:r>
+        <w:rPr>
+          <w:lang w:val="en_US" w:bidi="en_US"/>
+        </w:rPr>
+        <w:t>) to preach and cast out demons. They represented Jesus and had his authority.</w:t>
       </w:r>
       <w:r>
         <w:rPr>
@@ -8763,17 +8881,21 @@
       </w:r>
     </w:p>
     <w:p>
-      <w:pPr/>
-      <w:r>
-        <w:rPr>
-          <w:lang w:val="en_US" w:bidi="en_US"/>
-        </w:rPr>
-      </w:r>
-      <w:r>
-        <w:rPr>
-          <w:lang w:val="en_US" w:bidi="en_US"/>
-        </w:rPr>
-        <w:t>Simon and Andrew were brothers, as were James and John (</w:t>
+      <w:pPr>
+        <w:pStyle w:val="ListBullet"/>
+        <w:spacing w:line="240" w:lineRule="auto"/>
+        <w:ind w:left="720"/>
+      </w:pPr>
+      <w:r>
+        <w:rPr>
+          <w:lang w:val="en_US" w:bidi="en_US"/>
+        </w:rPr>
+      </w:r>
+      <w:r>
+        <w:rPr>
+          <w:lang w:val="en_US" w:bidi="en_US"/>
+        </w:rPr>
+        <w:t>Simon and Andrew were brothers, just like James and John (</w:t>
       </w:r>
       <w:hyperlink r:id="rId205">
         <w:r>
@@ -8791,7 +8913,45 @@
         <w:rPr>
           <w:lang w:val="en_US" w:bidi="en_US"/>
         </w:rPr>
-        <w:t>). • Peter is the Greek equivalent of the Aramaic kepa’, meaning “rock.”</w:t>
+        <w:t xml:space="preserve">). </w:t>
+      </w:r>
+    </w:p>
+    <w:p>
+      <w:pPr>
+        <w:pStyle w:val="ListBullet"/>
+        <w:spacing w:line="240" w:lineRule="auto"/>
+        <w:ind w:left="720"/>
+      </w:pPr>
+      <w:r>
+        <w:rPr>
+          <w:lang w:val="en_US" w:bidi="en_US"/>
+        </w:rPr>
+      </w:r>
+      <w:r>
+        <w:rPr>
+          <w:i/>
+          <w:lang w:val="en_US" w:bidi="en_US"/>
+        </w:rPr>
+        <w:t>Peter</w:t>
+      </w:r>
+      <w:r>
+        <w:rPr>
+          <w:lang w:val="en_US" w:bidi="en_US"/>
+        </w:rPr>
+        <w:t xml:space="preserve"> is the Greek version of the Aramaic word </w:t>
+      </w:r>
+      <w:r>
+        <w:rPr>
+          <w:i/>
+          <w:lang w:val="en_US" w:bidi="en_US"/>
+        </w:rPr>
+        <w:t>kepa’</w:t>
+      </w:r>
+      <w:r>
+        <w:rPr>
+          <w:lang w:val="en_US" w:bidi="en_US"/>
+        </w:rPr>
+        <w:t>, which means “rock.”</w:t>
       </w:r>
       <w:r>
         <w:rPr>
@@ -8837,9 +8997,22 @@
       </w:r>
       <w:r>
         <w:rPr>
-          <w:lang w:val="en_US" w:bidi="en_US"/>
-        </w:rPr>
-        <w:t xml:space="preserve">but Jesus nicknamed them “Sons of Thunder”: This nickname probably speaks of their character (cp. </w:t>
+          <w:i/>
+          <w:lang w:val="en_US" w:bidi="en_US"/>
+        </w:rPr>
+        <w:t>whom He named Boanerges, meaning “Sons of Thunder”</w:t>
+      </w:r>
+      <w:r>
+        <w:rPr>
+          <w:lang w:val="en_US" w:bidi="en_US"/>
+        </w:rPr>
+        <w:t xml:space="preserve">: </w:t>
+      </w:r>
+      <w:r>
+        <w:rPr>
+          <w:lang w:val="en_US" w:bidi="en_US"/>
+        </w:rPr>
+        <w:t xml:space="preserve">This likely describes their character. It may suggest strong emotions, boldness, or quick reactions. For example, they once wanted to call down fire on a village that rejected Jesus (see </w:t>
       </w:r>
       <w:hyperlink r:id="rId255">
         <w:r>
@@ -20295,14 +20468,14 @@
             <w:color w:val="0000EE"/>
             <w:u w:val="single"/>
           </w:rPr>
-          <w:t>Matt 8:5–13</w:t>
-        </w:r>
-      </w:hyperlink>
-      <w:r>
-        <w:rPr>
-          <w:lang w:val="en_US" w:bidi="en_US"/>
-        </w:rPr>
-        <w:t xml:space="preserve"> // </w:t>
+          <w:t>Matthew 8:5–13</w:t>
+        </w:r>
+      </w:hyperlink>
+      <w:r>
+        <w:rPr>
+          <w:lang w:val="en_US" w:bidi="en_US"/>
+        </w:rPr>
+        <w:t xml:space="preserve">, </w:t>
       </w:r>
       <w:hyperlink r:id="rId212">
         <w:r>
@@ -20320,7 +20493,7 @@
         <w:rPr>
           <w:lang w:val="en_US" w:bidi="en_US"/>
         </w:rPr>
-        <w:t xml:space="preserve"> and </w:t>
+        <w:t xml:space="preserve">, and </w:t>
       </w:r>
       <w:hyperlink r:id="rId484">
         <w:r>

</xml_diff>

<commit_message>
Update Bible study notes for all languages for 2026-05-11 release
</commit_message>
<xml_diff>
--- a/eng/docx/41.content.docx
+++ b/eng/docx/41.content.docx
@@ -27018,22 +27018,48 @@
       </w:r>
       <w:r>
         <w:rPr>
-          <w:lang w:val="en_US" w:bidi="en_US"/>
-        </w:rPr>
-        <w:t xml:space="preserve">But who do you say I am? In the Greek text, </w:t>
-      </w:r>
-      <w:r>
-        <w:rPr>
           <w:i/>
           <w:lang w:val="en_US" w:bidi="en_US"/>
         </w:rPr>
+        <w:t>Who do you say I am?</w:t>
+      </w:r>
+      <w:r>
+        <w:rPr>
+          <w:lang w:val="en_US" w:bidi="en_US"/>
+        </w:rPr>
+        <w:t>:</w:t>
+      </w:r>
+      <w:r>
+        <w:rPr>
+          <w:lang w:val="en_US" w:bidi="en_US"/>
+        </w:rPr>
+        <w:t xml:space="preserve"> In the Greek text, the word </w:t>
+      </w:r>
+      <w:r>
+        <w:rPr>
+          <w:i/>
+          <w:lang w:val="en_US" w:bidi="en_US"/>
+        </w:rPr>
         <w:t>you</w:t>
       </w:r>
       <w:r>
         <w:rPr>
           <w:lang w:val="en_US" w:bidi="en_US"/>
         </w:rPr>
-        <w:t xml:space="preserve"> is emphatic. Peter responded for the group, You are the Messiah. Peter’s confession was correct, as the command not to tell anyone about him indicates (see </w:t>
+        <w:t xml:space="preserve"> is emphatic. Peter spoke for the group, saying, </w:t>
+      </w:r>
+      <w:r>
+        <w:rPr>
+          <w:i/>
+          <w:lang w:val="en_US" w:bidi="en_US"/>
+        </w:rPr>
+        <w:t>You are the Christ</w:t>
+      </w:r>
+      <w:r>
+        <w:rPr>
+          <w:lang w:val="en_US" w:bidi="en_US"/>
+        </w:rPr>
+        <w:t xml:space="preserve">. Peter’s confession was correct, as the command not to tell anyone about him shows (see </w:t>
       </w:r>
       <w:hyperlink r:id="rId26">
         <w:r>
@@ -27098,7 +27124,7 @@
             <w:color w:val="0000EE"/>
             <w:u w:val="single"/>
           </w:rPr>
-          <w:t>Matt 16:17</w:t>
+          <w:t>Matthew 16:17</w:t>
         </w:r>
       </w:hyperlink>
       <w:r>
@@ -27143,17 +27169,21 @@
       </w:r>
     </w:p>
     <w:p>
-      <w:pPr/>
-      <w:r>
-        <w:rPr>
-          <w:lang w:val="en_US" w:bidi="en_US"/>
-        </w:rPr>
-      </w:r>
-      <w:r>
-        <w:rPr>
-          <w:lang w:val="en_US" w:bidi="en_US"/>
-        </w:rPr>
-        <w:t xml:space="preserve">It was a divine necessity that Jesus must suffer (see also </w:t>
+      <w:pPr>
+        <w:pStyle w:val="ListBullet"/>
+        <w:spacing w:line="240" w:lineRule="auto"/>
+        <w:ind w:left="720"/>
+      </w:pPr>
+      <w:r>
+        <w:rPr>
+          <w:lang w:val="en_US" w:bidi="en_US"/>
+        </w:rPr>
+      </w:r>
+      <w:r>
+        <w:rPr>
+          <w:lang w:val="en_US" w:bidi="en_US"/>
+        </w:rPr>
+        <w:t xml:space="preserve">God thought it necessary for Jesus to suffer (see also </w:t>
       </w:r>
       <w:hyperlink r:id="rId547">
         <w:r>
@@ -27207,7 +27237,7 @@
         <w:rPr>
           <w:lang w:val="en_US" w:bidi="en_US"/>
         </w:rPr>
-        <w:t xml:space="preserve">). The immediate cause for Jesus’ suffering was the elders, the leading priests, and the teachers of religious law (see </w:t>
+        <w:t xml:space="preserve">). The elders, leading priests, and teachers of religious law caused his suffering. But it was ultimately God's will (see </w:t>
       </w:r>
       <w:hyperlink r:id="rId92">
         <w:r>
@@ -27315,20 +27345,63 @@
         <w:rPr>
           <w:lang w:val="en_US" w:bidi="en_US"/>
         </w:rPr>
-        <w:t xml:space="preserve">), but the ultimate cause was the will of God. • Jesus’ death would not be the end, for three days later he would rise from the dead. • Three days later is a synonym for </w:t>
+        <w:t xml:space="preserve">). </w:t>
+      </w:r>
+    </w:p>
+    <w:p>
+      <w:pPr>
+        <w:pStyle w:val="ListBullet"/>
+        <w:spacing w:line="240" w:lineRule="auto"/>
+        <w:ind w:left="720"/>
+      </w:pPr>
+      <w:r>
+        <w:rPr>
+          <w:lang w:val="en_US" w:bidi="en_US"/>
+        </w:rPr>
+      </w:r>
+      <w:r>
+        <w:rPr>
+          <w:lang w:val="en_US" w:bidi="en_US"/>
+        </w:rPr>
+        <w:t xml:space="preserve">The death of Jesus would not be the end. Three days later, he would rise from the dead. </w:t>
+      </w:r>
+    </w:p>
+    <w:p>
+      <w:pPr>
+        <w:pStyle w:val="ListBullet"/>
+        <w:spacing w:line="240" w:lineRule="auto"/>
+        <w:ind w:left="720"/>
+      </w:pPr>
+      <w:r>
+        <w:rPr>
+          <w:lang w:val="en_US" w:bidi="en_US"/>
+        </w:rPr>
       </w:r>
       <w:r>
         <w:rPr>
           <w:i/>
           <w:lang w:val="en_US" w:bidi="en_US"/>
         </w:rPr>
-        <w:t>on the third day</w:t>
-      </w:r>
-      <w:r>
-        <w:rPr>
-          <w:lang w:val="en_US" w:bidi="en_US"/>
-        </w:rPr>
-        <w:t xml:space="preserve"> (</w:t>
+        <w:t>after three days</w:t>
+      </w:r>
+      <w:r>
+        <w:rPr>
+          <w:lang w:val="en_US" w:bidi="en_US"/>
+        </w:rPr>
+        <w:t>: This has the same meaning as "on the third day" and "will be three days and three nights"</w:t>
+      </w:r>
+      <w:r>
+        <w:rPr>
+          <w:i/>
+          <w:lang w:val="en_US" w:bidi="en_US"/>
+        </w:rPr>
+        <w:t xml:space="preserve"> </w:t>
+      </w:r>
+      <w:r>
+        <w:rPr>
+          <w:lang w:val="en_US" w:bidi="en_US"/>
+        </w:rPr>
+        <w:t>(</w:t>
       </w:r>
       <w:hyperlink r:id="rId553">
         <w:r>
@@ -27339,7 +27412,7 @@
             <w:color w:val="0000EE"/>
             <w:u w:val="single"/>
           </w:rPr>
-          <w:t>Matt 16:21</w:t>
+          <w:t>Matthew 16:21</w:t>
         </w:r>
       </w:hyperlink>
       <w:r>
@@ -27364,31 +27437,258 @@
         <w:rPr>
           <w:lang w:val="en_US" w:bidi="en_US"/>
         </w:rPr>
-        <w:t xml:space="preserve">) and </w:t>
+        <w:t xml:space="preserve">; </w:t>
+      </w:r>
+      <w:hyperlink r:id="rId555">
+        <w:r>
+          <w:rPr>
+            <w:lang w:val="en_US" w:bidi="en_US"/>
+          </w:rPr>
+          <w:rPr>
+            <w:color w:val="0000EE"/>
+            <w:u w:val="single"/>
+          </w:rPr>
+          <w:t>Matthew 12:40</w:t>
+        </w:r>
+      </w:hyperlink>
+      <w:r>
+        <w:rPr>
+          <w:lang w:val="en_US" w:bidi="en_US"/>
+        </w:rPr>
+        <w:t>).</w:t>
+      </w:r>
+      <w:r>
+        <w:rPr>
+          <w:lang w:val="en_US" w:bidi="en_US"/>
+        </w:rPr>
+      </w:r>
+      <w:r>
+        <w:rPr>
+          <w:lang w:val="en_US" w:bidi="en_US"/>
+        </w:rPr>
+      </w:r>
+    </w:p>
+    <w:p>
+      <w:pPr/>
+      <w:r>
+        <w:rPr>
+          <w:lang w:val="en_US" w:bidi="en_US"/>
+        </w:rPr>
+      </w:r>
+    </w:p>
+    <w:p>
+      <w:pPr>
+        <w:pStyle w:val="Heading2"/>
+      </w:pPr>
+      <w:r>
+        <w:rPr>
+          <w:lang w:val="en_US" w:bidi="en_US"/>
+        </w:rPr>
+        <w:t>Mark 8:31–38</w:t>
+      </w:r>
+      <w:r>
+        <w:rPr>
+          <w:lang w:val="en_US" w:bidi="en_US"/>
+        </w:rPr>
+      </w:r>
+    </w:p>
+    <w:p>
+      <w:pPr/>
+      <w:r>
+        <w:rPr>
+          <w:lang w:val="en_US" w:bidi="en_US"/>
+        </w:rPr>
       </w:r>
       <w:r>
         <w:rPr>
           <w:i/>
           <w:lang w:val="en_US" w:bidi="en_US"/>
         </w:rPr>
-        <w:t>after three days and three nights</w:t>
-      </w:r>
-      <w:r>
-        <w:rPr>
-          <w:lang w:val="en_US" w:bidi="en_US"/>
-        </w:rPr>
-        <w:t xml:space="preserve"> (</w:t>
-      </w:r>
-      <w:hyperlink r:id="rId555">
-        <w:r>
-          <w:rPr>
-            <w:lang w:val="en_US" w:bidi="en_US"/>
-          </w:rPr>
-          <w:rPr>
-            <w:color w:val="0000EE"/>
-            <w:u w:val="single"/>
-          </w:rPr>
-          <w:t>Matt 12:40</w:t>
+        <w:t>Then He began to teach them that the Son of Man must suffer many things and be rejected by the elders, chief priests, and scribes, and that He must be killed and after three days rise again</w:t>
+      </w:r>
+      <w:r>
+        <w:rPr>
+          <w:lang w:val="en_US" w:bidi="en_US"/>
+        </w:rPr>
+        <w:t>: Jesus now clearly predicted what he had previously revealed in a hidden way (</w:t>
+      </w:r>
+      <w:hyperlink r:id="rId556">
+        <w:r>
+          <w:rPr>
+            <w:lang w:val="en_US" w:bidi="en_US"/>
+          </w:rPr>
+          <w:rPr>
+            <w:color w:val="0000EE"/>
+            <w:u w:val="single"/>
+          </w:rPr>
+          <w:t>2:19–20</w:t>
+        </w:r>
+      </w:hyperlink>
+      <w:r>
+        <w:rPr>
+          <w:lang w:val="en_US" w:bidi="en_US"/>
+        </w:rPr>
+        <w:t>). In response, Peter objected, so Jesus taught him and the other disciples the nature of his mission and what it really means to follow him.</w:t>
+      </w:r>
+      <w:r>
+        <w:rPr>
+          <w:lang w:val="en_US" w:bidi="en_US"/>
+        </w:rPr>
+      </w:r>
+      <w:r>
+        <w:rPr>
+          <w:lang w:val="en_US" w:bidi="en_US"/>
+        </w:rPr>
+      </w:r>
+    </w:p>
+    <w:p>
+      <w:pPr/>
+      <w:r>
+        <w:rPr>
+          <w:lang w:val="en_US" w:bidi="en_US"/>
+        </w:rPr>
+      </w:r>
+    </w:p>
+    <w:p>
+      <w:pPr>
+        <w:pStyle w:val="Heading2"/>
+      </w:pPr>
+      <w:r>
+        <w:rPr>
+          <w:lang w:val="en_US" w:bidi="en_US"/>
+        </w:rPr>
+        <w:t>Mark 8:32</w:t>
+      </w:r>
+      <w:r>
+        <w:rPr>
+          <w:lang w:val="en_US" w:bidi="en_US"/>
+        </w:rPr>
+      </w:r>
+    </w:p>
+    <w:p>
+      <w:pPr/>
+      <w:r>
+        <w:rPr>
+          <w:lang w:val="en_US" w:bidi="en_US"/>
+        </w:rPr>
+      </w:r>
+      <w:r>
+        <w:rPr>
+          <w:lang w:val="en_US" w:bidi="en_US"/>
+        </w:rPr>
+        <w:t>Peter understood what Jesus had said, but he did not accept it. Peter shared the popular idea that the Messiah was to be a victorious national ruler, so he thought it made no sense for Jesus to talk of suffering and death.</w:t>
+      </w:r>
+      <w:r>
+        <w:rPr>
+          <w:lang w:val="en_US" w:bidi="en_US"/>
+        </w:rPr>
+      </w:r>
+      <w:r>
+        <w:rPr>
+          <w:lang w:val="en_US" w:bidi="en_US"/>
+        </w:rPr>
+      </w:r>
+    </w:p>
+    <w:p>
+      <w:pPr/>
+      <w:r>
+        <w:rPr>
+          <w:lang w:val="en_US" w:bidi="en_US"/>
+        </w:rPr>
+      </w:r>
+    </w:p>
+    <w:p>
+      <w:pPr>
+        <w:pStyle w:val="Heading2"/>
+      </w:pPr>
+      <w:r>
+        <w:rPr>
+          <w:lang w:val="en_US" w:bidi="en_US"/>
+        </w:rPr>
+        <w:t>Mark 8:33</w:t>
+      </w:r>
+      <w:r>
+        <w:rPr>
+          <w:lang w:val="en_US" w:bidi="en_US"/>
+        </w:rPr>
+      </w:r>
+    </w:p>
+    <w:p>
+      <w:pPr>
+        <w:pStyle w:val="ListBullet"/>
+        <w:spacing w:line="240" w:lineRule="auto"/>
+        <w:ind w:left="720"/>
+      </w:pPr>
+      <w:r>
+        <w:rPr>
+          <w:lang w:val="en_US" w:bidi="en_US"/>
+        </w:rPr>
+      </w:r>
+      <w:r>
+        <w:rPr>
+          <w:lang w:val="en_US" w:bidi="en_US"/>
+        </w:rPr>
+        <w:t xml:space="preserve">Jesus looked at his disciples before he corrected Peter in public. He wanted them to understand Peter's mistake. </w:t>
+      </w:r>
+    </w:p>
+    <w:p>
+      <w:pPr>
+        <w:pStyle w:val="ListBullet"/>
+        <w:spacing w:line="240" w:lineRule="auto"/>
+        <w:ind w:left="720"/>
+      </w:pPr>
+      <w:r>
+        <w:rPr>
+          <w:lang w:val="en_US" w:bidi="en_US"/>
+        </w:rPr>
+      </w:r>
+      <w:r>
+        <w:rPr>
+          <w:i/>
+          <w:lang w:val="en_US" w:bidi="en_US"/>
+        </w:rPr>
+        <w:t>Get behind Me, Satan!</w:t>
+      </w:r>
+      <w:r>
+        <w:rPr>
+          <w:lang w:val="en_US" w:bidi="en_US"/>
+        </w:rPr>
+        <w:t>:</w:t>
+      </w:r>
+      <w:r>
+        <w:rPr>
+          <w:lang w:val="en_US" w:bidi="en_US"/>
+        </w:rPr>
+        <w:t xml:space="preserve"> Jesus does not mean that a demon possessed Peter. Peter spoke from a human perspective, not God's. So without knowing it, he spoke for Satan, "the god of this age" (</w:t>
+      </w:r>
+      <w:hyperlink r:id="rId557">
+        <w:r>
+          <w:rPr>
+            <w:lang w:val="en_US" w:bidi="en_US"/>
+          </w:rPr>
+          <w:rPr>
+            <w:color w:val="0000EE"/>
+            <w:u w:val="single"/>
+          </w:rPr>
+          <w:t>2 Corinthians 4:4</w:t>
+        </w:r>
+      </w:hyperlink>
+      <w:r>
+        <w:rPr>
+          <w:lang w:val="en_US" w:bidi="en_US"/>
+        </w:rPr>
+        <w:t xml:space="preserve">). He repeated Satan's temptation (compare </w:t>
+      </w:r>
+      <w:hyperlink r:id="rId558">
+        <w:r>
+          <w:rPr>
+            <w:lang w:val="en_US" w:bidi="en_US"/>
+          </w:rPr>
+          <w:rPr>
+            <w:color w:val="0000EE"/>
+            <w:u w:val="single"/>
+          </w:rPr>
+          <w:t>Matthew 4:8–10</w:t>
         </w:r>
       </w:hyperlink>
       <w:r>
@@ -27424,44 +27724,99 @@
         <w:rPr>
           <w:lang w:val="en_US" w:bidi="en_US"/>
         </w:rPr>
-        <w:t>Mark 8:31–38</w:t>
-      </w:r>
-      <w:r>
-        <w:rPr>
-          <w:lang w:val="en_US" w:bidi="en_US"/>
-        </w:rPr>
-      </w:r>
-    </w:p>
-    <w:p>
-      <w:pPr/>
-      <w:r>
-        <w:rPr>
-          <w:lang w:val="en_US" w:bidi="en_US"/>
-        </w:rPr>
-      </w:r>
-      <w:r>
-        <w:rPr>
-          <w:lang w:val="en_US" w:bidi="en_US"/>
-        </w:rPr>
-        <w:t>Then Jesus began to teach the disciples that he would suffer and be killed in Jerusalem and three days later . . . rise from the dead. Jesus now explicitly predicted what he had revealed in veiled form (</w:t>
-      </w:r>
-      <w:hyperlink r:id="rId556">
-        <w:r>
-          <w:rPr>
-            <w:lang w:val="en_US" w:bidi="en_US"/>
-          </w:rPr>
-          <w:rPr>
-            <w:color w:val="0000EE"/>
-            <w:u w:val="single"/>
-          </w:rPr>
-          <w:t>2:19–20</w:t>
-        </w:r>
-      </w:hyperlink>
-      <w:r>
-        <w:rPr>
-          <w:lang w:val="en_US" w:bidi="en_US"/>
-        </w:rPr>
-        <w:t>). In response, Peter objected, so Jesus taught him and the other disciples the nature of his mission and what it really means to follow him.</w:t>
+        <w:t>Mark 8:34–38</w:t>
+      </w:r>
+      <w:r>
+        <w:rPr>
+          <w:lang w:val="en_US" w:bidi="en_US"/>
+        </w:rPr>
+      </w:r>
+    </w:p>
+    <w:p>
+      <w:pPr>
+        <w:pStyle w:val="ListBullet"/>
+        <w:spacing w:line="240" w:lineRule="auto"/>
+        <w:ind w:left="720"/>
+      </w:pPr>
+      <w:r>
+        <w:rPr>
+          <w:lang w:val="en_US" w:bidi="en_US"/>
+        </w:rPr>
+      </w:r>
+      <w:r>
+        <w:rPr>
+          <w:lang w:val="en_US" w:bidi="en_US"/>
+        </w:rPr>
+        <w:t>Jesus invites his disciples and the crowd to understand what following him will cost them.</w:t>
+      </w:r>
+    </w:p>
+    <w:p>
+      <w:pPr>
+        <w:pStyle w:val="ListBullet"/>
+        <w:spacing w:line="240" w:lineRule="auto"/>
+        <w:ind w:left="720"/>
+      </w:pPr>
+      <w:r>
+        <w:rPr>
+          <w:lang w:val="en_US" w:bidi="en_US"/>
+        </w:rPr>
+      </w:r>
+      <w:r>
+        <w:rPr>
+          <w:i/>
+          <w:lang w:val="en_US" w:bidi="en_US"/>
+        </w:rPr>
+        <w:t>must deny himself</w:t>
+      </w:r>
+      <w:r>
+        <w:rPr>
+          <w:lang w:val="en_US" w:bidi="en_US"/>
+        </w:rPr>
+        <w:t>:</w:t>
+      </w:r>
+      <w:r>
+        <w:rPr>
+          <w:i/>
+          <w:lang w:val="en_US" w:bidi="en_US"/>
+        </w:rPr>
+        <w:t xml:space="preserve"> </w:t>
+      </w:r>
+      <w:r>
+        <w:rPr>
+          <w:lang w:val="en_US" w:bidi="en_US"/>
+        </w:rPr>
+        <w:t>This</w:t>
+      </w:r>
+      <w:r>
+        <w:rPr>
+          <w:i/>
+          <w:lang w:val="en_US" w:bidi="en_US"/>
+        </w:rPr>
+        <w:t xml:space="preserve"> </w:t>
+      </w:r>
+      <w:r>
+        <w:rPr>
+          <w:lang w:val="en_US" w:bidi="en_US"/>
+        </w:rPr>
+        <w:t xml:space="preserve">means letting Jesus decide your goals and purposes in life. Taking up your cross is a metaphor (compare </w:t>
+      </w:r>
+      <w:hyperlink r:id="rId559">
+        <w:r>
+          <w:rPr>
+            <w:lang w:val="en_US" w:bidi="en_US"/>
+          </w:rPr>
+          <w:rPr>
+            <w:color w:val="0000EE"/>
+            <w:u w:val="single"/>
+          </w:rPr>
+          <w:t>Luke 9:23</w:t>
+        </w:r>
+      </w:hyperlink>
+      <w:r>
+        <w:rPr>
+          <w:lang w:val="en_US" w:bidi="en_US"/>
+        </w:rPr>
+        <w:t>). It means being faithful to Jesus, even to the point of death if necessary. Following the teachings and example of Jesus requires continual commitment.</w:t>
       </w:r>
       <w:r>
         <w:rPr>
@@ -27490,26 +27845,65 @@
         <w:rPr>
           <w:lang w:val="en_US" w:bidi="en_US"/>
         </w:rPr>
-        <w:t>Mark 8:32</w:t>
-      </w:r>
-      <w:r>
-        <w:rPr>
-          <w:lang w:val="en_US" w:bidi="en_US"/>
-        </w:rPr>
-      </w:r>
-    </w:p>
-    <w:p>
-      <w:pPr/>
-      <w:r>
-        <w:rPr>
-          <w:lang w:val="en_US" w:bidi="en_US"/>
-        </w:rPr>
-      </w:r>
-      <w:r>
-        <w:rPr>
-          <w:lang w:val="en_US" w:bidi="en_US"/>
-        </w:rPr>
-        <w:t>Peter understood what Jesus had said, but he did not accept it. Peter shared the popular idea that the Messiah was to be a victorious national ruler, so he thought Jesus’ talk of suffering and death was nonsense.</w:t>
+        <w:t>Mark 8:35</w:t>
+      </w:r>
+      <w:r>
+        <w:rPr>
+          <w:lang w:val="en_US" w:bidi="en_US"/>
+        </w:rPr>
+      </w:r>
+    </w:p>
+    <w:p>
+      <w:pPr/>
+      <w:r>
+        <w:rPr>
+          <w:lang w:val="en_US" w:bidi="en_US"/>
+        </w:rPr>
+      </w:r>
+      <w:r>
+        <w:rPr>
+          <w:lang w:val="en_US" w:bidi="en_US"/>
+        </w:rPr>
+        <w:t xml:space="preserve">If a person tries </w:t>
+      </w:r>
+      <w:r>
+        <w:rPr>
+          <w:i/>
+          <w:lang w:val="en_US" w:bidi="en_US"/>
+        </w:rPr>
+        <w:t>to save his life</w:t>
+      </w:r>
+      <w:r>
+        <w:rPr>
+          <w:lang w:val="en_US" w:bidi="en_US"/>
+        </w:rPr>
+        <w:t xml:space="preserve"> by rejecting Jesus, that person </w:t>
+      </w:r>
+      <w:r>
+        <w:rPr>
+          <w:i/>
+          <w:lang w:val="en_US" w:bidi="en_US"/>
+        </w:rPr>
+        <w:t>will lose it</w:t>
+      </w:r>
+      <w:r>
+        <w:rPr>
+          <w:lang w:val="en_US" w:bidi="en_US"/>
+        </w:rPr>
+        <w:t xml:space="preserve"> in the next world. But if you give your life to Jesus and the spread of the gospel, you </w:t>
+      </w:r>
+      <w:r>
+        <w:rPr>
+          <w:i/>
+          <w:lang w:val="en_US" w:bidi="en_US"/>
+        </w:rPr>
+        <w:t>will save it</w:t>
+      </w:r>
+      <w:r>
+        <w:rPr>
+          <w:lang w:val="en_US" w:bidi="en_US"/>
+        </w:rPr>
+        <w:t xml:space="preserve"> forever.</w:t>
       </w:r>
       <w:r>
         <w:rPr>
@@ -27538,55 +27932,139 @@
         <w:rPr>
           <w:lang w:val="en_US" w:bidi="en_US"/>
         </w:rPr>
-        <w:t>Mark 8:33</w:t>
-      </w:r>
-      <w:r>
-        <w:rPr>
-          <w:lang w:val="en_US" w:bidi="en_US"/>
-        </w:rPr>
-      </w:r>
-    </w:p>
-    <w:p>
-      <w:pPr/>
-      <w:r>
-        <w:rPr>
-          <w:lang w:val="en_US" w:bidi="en_US"/>
-        </w:rPr>
-      </w:r>
-      <w:r>
-        <w:rPr>
-          <w:lang w:val="en_US" w:bidi="en_US"/>
-        </w:rPr>
-        <w:t>Jesus looked at his disciples before he publicly rebuked Peter; he wanted them to understand that Peter was wrong. • Get away from me, Satan does not mean that Peter was demon-possessed. Peter spoke from a human point of view, not from God’s, so he unwittingly spoke for Satan, the god of this world (</w:t>
-      </w:r>
-      <w:hyperlink r:id="rId557">
-        <w:r>
-          <w:rPr>
-            <w:lang w:val="en_US" w:bidi="en_US"/>
-          </w:rPr>
-          <w:rPr>
-            <w:color w:val="0000EE"/>
-            <w:u w:val="single"/>
-          </w:rPr>
-          <w:t>2 Cor 4:4</w:t>
-        </w:r>
-      </w:hyperlink>
-      <w:r>
-        <w:rPr>
-          <w:lang w:val="en_US" w:bidi="en_US"/>
-        </w:rPr>
-        <w:t xml:space="preserve">), and repeated Satan’s temptation (cp. </w:t>
-      </w:r>
-      <w:hyperlink r:id="rId558">
-        <w:r>
-          <w:rPr>
-            <w:lang w:val="en_US" w:bidi="en_US"/>
-          </w:rPr>
-          <w:rPr>
-            <w:color w:val="0000EE"/>
-            <w:u w:val="single"/>
-          </w:rPr>
-          <w:t>Matt 4:8–10</w:t>
+        <w:t>Mark 8:36–37</w:t>
+      </w:r>
+      <w:r>
+        <w:rPr>
+          <w:lang w:val="en_US" w:bidi="en_US"/>
+        </w:rPr>
+      </w:r>
+    </w:p>
+    <w:p>
+      <w:pPr/>
+      <w:r>
+        <w:rPr>
+          <w:lang w:val="en_US" w:bidi="en_US"/>
+        </w:rPr>
+      </w:r>
+      <w:r>
+        <w:rPr>
+          <w:lang w:val="en_US" w:bidi="en_US"/>
+        </w:rPr>
+        <w:t>The implied answer to the rhetorical question Jesus asks is that possessing the entire world has no value if you give up eternal life. “He is no fool who gives what he cannot keep to gain that which he cannot lose” (Jim Elliot). You need your soul to enjoy the benefits of the world to come. When you forfeit your life or soul, there is nothing you can give to purchase it back.</w:t>
+      </w:r>
+      <w:r>
+        <w:rPr>
+          <w:lang w:val="en_US" w:bidi="en_US"/>
+        </w:rPr>
+      </w:r>
+      <w:r>
+        <w:rPr>
+          <w:lang w:val="en_US" w:bidi="en_US"/>
+        </w:rPr>
+      </w:r>
+    </w:p>
+    <w:p>
+      <w:pPr/>
+      <w:r>
+        <w:rPr>
+          <w:lang w:val="en_US" w:bidi="en_US"/>
+        </w:rPr>
+      </w:r>
+    </w:p>
+    <w:p>
+      <w:pPr>
+        <w:pStyle w:val="Heading2"/>
+      </w:pPr>
+      <w:r>
+        <w:rPr>
+          <w:lang w:val="en_US" w:bidi="en_US"/>
+        </w:rPr>
+        <w:t>Mark 8:38</w:t>
+      </w:r>
+      <w:r>
+        <w:rPr>
+          <w:lang w:val="en_US" w:bidi="en_US"/>
+        </w:rPr>
+      </w:r>
+    </w:p>
+    <w:p>
+      <w:pPr/>
+      <w:r>
+        <w:rPr>
+          <w:lang w:val="en_US" w:bidi="en_US"/>
+        </w:rPr>
+      </w:r>
+      <w:r>
+        <w:rPr>
+          <w:lang w:val="en_US" w:bidi="en_US"/>
+        </w:rPr>
+        <w:t xml:space="preserve">When Jesus, as the Son of Man, returns in glory to judge the world, he will be ashamed of those who were ashamed to be identified with him and his message (compare </w:t>
+      </w:r>
+      <w:hyperlink r:id="rId560">
+        <w:r>
+          <w:rPr>
+            <w:lang w:val="en_US" w:bidi="en_US"/>
+          </w:rPr>
+          <w:rPr>
+            <w:color w:val="0000EE"/>
+            <w:u w:val="single"/>
+          </w:rPr>
+          <w:t>Matthew 7:21–23</w:t>
+        </w:r>
+      </w:hyperlink>
+      <w:r>
+        <w:rPr>
+          <w:lang w:val="en_US" w:bidi="en_US"/>
+        </w:rPr>
+        <w:t xml:space="preserve">; </w:t>
+      </w:r>
+      <w:hyperlink r:id="rId561">
+        <w:r>
+          <w:rPr>
+            <w:lang w:val="en_US" w:bidi="en_US"/>
+          </w:rPr>
+          <w:rPr>
+            <w:color w:val="0000EE"/>
+            <w:u w:val="single"/>
+          </w:rPr>
+          <w:t>10:32–33</w:t>
+        </w:r>
+      </w:hyperlink>
+      <w:r>
+        <w:rPr>
+          <w:lang w:val="en_US" w:bidi="en_US"/>
+        </w:rPr>
+        <w:t xml:space="preserve">; </w:t>
+      </w:r>
+      <w:hyperlink r:id="rId562">
+        <w:r>
+          <w:rPr>
+            <w:lang w:val="en_US" w:bidi="en_US"/>
+          </w:rPr>
+          <w:rPr>
+            <w:color w:val="0000EE"/>
+            <w:u w:val="single"/>
+          </w:rPr>
+          <w:t>Luke 12:8–9</w:t>
+        </w:r>
+      </w:hyperlink>
+      <w:r>
+        <w:rPr>
+          <w:lang w:val="en_US" w:bidi="en_US"/>
+        </w:rPr>
+        <w:t xml:space="preserve">; </w:t>
+      </w:r>
+      <w:hyperlink r:id="rId563">
+        <w:r>
+          <w:rPr>
+            <w:lang w:val="en_US" w:bidi="en_US"/>
+          </w:rPr>
+          <w:rPr>
+            <w:color w:val="0000EE"/>
+            <w:u w:val="single"/>
+          </w:rPr>
+          <w:t>2 Timothy 2:12</w:t>
         </w:r>
       </w:hyperlink>
       <w:r>
@@ -27622,44 +28100,191 @@
         <w:rPr>
           <w:lang w:val="en_US" w:bidi="en_US"/>
         </w:rPr>
-        <w:t>Mark 8:34–38</w:t>
-      </w:r>
-      <w:r>
-        <w:rPr>
-          <w:lang w:val="en_US" w:bidi="en_US"/>
-        </w:rPr>
-      </w:r>
-    </w:p>
-    <w:p>
-      <w:pPr/>
-      <w:r>
-        <w:rPr>
-          <w:lang w:val="en_US" w:bidi="en_US"/>
-        </w:rPr>
-      </w:r>
-      <w:r>
-        <w:rPr>
-          <w:lang w:val="en_US" w:bidi="en_US"/>
-        </w:rPr>
-        <w:t xml:space="preserve">Jesus’ invitation to his disciples and the crowd lays out the cost of being his follower. • To give up your own way involves letting Jesus determine your goals and purposes in life. To take up your cross is metaphorical (cp. </w:t>
-      </w:r>
-      <w:hyperlink r:id="rId559">
-        <w:r>
-          <w:rPr>
-            <w:lang w:val="en_US" w:bidi="en_US"/>
-          </w:rPr>
-          <w:rPr>
-            <w:color w:val="0000EE"/>
-            <w:u w:val="single"/>
-          </w:rPr>
-          <w:t>Luke 9:23</w:t>
-        </w:r>
-      </w:hyperlink>
-      <w:r>
-        <w:rPr>
-          <w:lang w:val="en_US" w:bidi="en_US"/>
-        </w:rPr>
-        <w:t>); it indicates that faithfulness to Jesus must extend, if required, even to the point of death. To follow Jesus’ teaching and example is a continual commitment.</w:t>
+        <w:t>Mark 9:1</w:t>
+      </w:r>
+      <w:r>
+        <w:rPr>
+          <w:lang w:val="en_US" w:bidi="en_US"/>
+        </w:rPr>
+      </w:r>
+    </w:p>
+    <w:p>
+      <w:pPr/>
+      <w:r>
+        <w:rPr>
+          <w:lang w:val="en_US" w:bidi="en_US"/>
+        </w:rPr>
+      </w:r>
+      <w:r>
+        <w:rPr>
+          <w:i/>
+          <w:lang w:val="en_US" w:bidi="en_US"/>
+        </w:rPr>
+        <w:t>Truly I tell you</w:t>
+      </w:r>
+      <w:r>
+        <w:rPr>
+          <w:lang w:val="en_US" w:bidi="en_US"/>
+        </w:rPr>
+        <w:t xml:space="preserve">: This introductory phrase shows that this promise is important, but people debate what the promise means. It might mean that some disciples will: </w:t>
+      </w:r>
+    </w:p>
+    <w:p>
+      <w:pPr>
+        <w:pStyle w:val="ListBullet"/>
+        <w:spacing w:line="240" w:lineRule="auto"/>
+        <w:ind w:left="720"/>
+      </w:pPr>
+      <w:r>
+        <w:rPr>
+          <w:lang w:val="en_US" w:bidi="en_US"/>
+        </w:rPr>
+      </w:r>
+      <w:r>
+        <w:rPr>
+          <w:lang w:val="en_US" w:bidi="en_US"/>
+        </w:rPr>
+        <w:t xml:space="preserve">witness the resurrection of Jesus from the dead (chapter </w:t>
+      </w:r>
+      <w:hyperlink r:id="rId564">
+        <w:r>
+          <w:rPr>
+            <w:lang w:val="en_US" w:bidi="en_US"/>
+          </w:rPr>
+          <w:rPr>
+            <w:color w:val="0000EE"/>
+            <w:u w:val="single"/>
+          </w:rPr>
+          <w:t>16</w:t>
+        </w:r>
+      </w:hyperlink>
+      <w:r>
+        <w:rPr>
+          <w:lang w:val="en_US" w:bidi="en_US"/>
+        </w:rPr>
+        <w:t>);</w:t>
+      </w:r>
+    </w:p>
+    <w:p>
+      <w:pPr>
+        <w:pStyle w:val="ListBullet"/>
+        <w:spacing w:line="240" w:lineRule="auto"/>
+        <w:ind w:left="720"/>
+      </w:pPr>
+      <w:r>
+        <w:rPr>
+          <w:lang w:val="en_US" w:bidi="en_US"/>
+        </w:rPr>
+      </w:r>
+      <w:r>
+        <w:rPr>
+          <w:lang w:val="en_US" w:bidi="en_US"/>
+        </w:rPr>
+        <w:t>experience the coming of the Holy Spirit upon the church (</w:t>
+      </w:r>
+      <w:hyperlink r:id="rId565">
+        <w:r>
+          <w:rPr>
+            <w:lang w:val="en_US" w:bidi="en_US"/>
+          </w:rPr>
+          <w:rPr>
+            <w:color w:val="0000EE"/>
+            <w:u w:val="single"/>
+          </w:rPr>
+          <w:t>Acts 2</w:t>
+        </w:r>
+      </w:hyperlink>
+      <w:r>
+        <w:rPr>
+          <w:lang w:val="en_US" w:bidi="en_US"/>
+        </w:rPr>
+        <w:t xml:space="preserve">); </w:t>
+      </w:r>
+    </w:p>
+    <w:p>
+      <w:pPr>
+        <w:pStyle w:val="ListBullet"/>
+        <w:spacing w:line="240" w:lineRule="auto"/>
+        <w:ind w:left="720"/>
+      </w:pPr>
+      <w:r>
+        <w:rPr>
+          <w:lang w:val="en_US" w:bidi="en_US"/>
+        </w:rPr>
+      </w:r>
+      <w:r>
+        <w:rPr>
+          <w:lang w:val="en_US" w:bidi="en_US"/>
+        </w:rPr>
+        <w:t>witness the destruction of Jerusalem in AD 70; or</w:t>
+      </w:r>
+    </w:p>
+    <w:p>
+      <w:pPr>
+        <w:pStyle w:val="ListBullet"/>
+        <w:spacing w:line="240" w:lineRule="auto"/>
+        <w:ind w:left="720"/>
+      </w:pPr>
+      <w:r>
+        <w:rPr>
+          <w:lang w:val="en_US" w:bidi="en_US"/>
+        </w:rPr>
+      </w:r>
+      <w:r>
+        <w:rPr>
+          <w:lang w:val="en_US" w:bidi="en_US"/>
+        </w:rPr>
+        <w:t xml:space="preserve">witness the transfiguration of Jesus as a preview of God's coming kingdom. </w:t>
+      </w:r>
+    </w:p>
+    <w:p>
+      <w:pPr/>
+      <w:r>
+        <w:rPr>
+          <w:lang w:val="en_US" w:bidi="en_US"/>
+        </w:rPr>
+      </w:r>
+      <w:r>
+        <w:rPr>
+          <w:lang w:val="en_US" w:bidi="en_US"/>
+        </w:rPr>
+        <w:t>Mark places this promise right before the transfiguration story (</w:t>
+      </w:r>
+      <w:hyperlink r:id="rId566">
+        <w:r>
+          <w:rPr>
+            <w:lang w:val="en_US" w:bidi="en_US"/>
+          </w:rPr>
+          <w:rPr>
+            <w:color w:val="0000EE"/>
+            <w:u w:val="single"/>
+          </w:rPr>
+          <w:t>Mark 9:2–8</w:t>
+        </w:r>
+      </w:hyperlink>
+      <w:r>
+        <w:rPr>
+          <w:lang w:val="en_US" w:bidi="en_US"/>
+        </w:rPr>
+        <w:t xml:space="preserve">). This suggests he likely considered the transfiguration as its fulfillment (see </w:t>
+      </w:r>
+      <w:hyperlink r:id="rId567">
+        <w:r>
+          <w:rPr>
+            <w:lang w:val="en_US" w:bidi="en_US"/>
+          </w:rPr>
+          <w:rPr>
+            <w:color w:val="0000EE"/>
+            <w:u w:val="single"/>
+          </w:rPr>
+          <w:t>2 Peter 1:16–18</w:t>
+        </w:r>
+      </w:hyperlink>
+      <w:r>
+        <w:rPr>
+          <w:lang w:val="en_US" w:bidi="en_US"/>
+        </w:rPr>
+        <w:t>).</w:t>
       </w:r>
       <w:r>
         <w:rPr>
@@ -27688,39 +28313,277 @@
         <w:rPr>
           <w:lang w:val="en_US" w:bidi="en_US"/>
         </w:rPr>
-        <w:t>Mark 8:35</w:t>
-      </w:r>
-      <w:r>
-        <w:rPr>
-          <w:lang w:val="en_US" w:bidi="en_US"/>
-        </w:rPr>
-      </w:r>
-    </w:p>
-    <w:p>
-      <w:pPr/>
-      <w:r>
-        <w:rPr>
-          <w:lang w:val="en_US" w:bidi="en_US"/>
-        </w:rPr>
-      </w:r>
-      <w:r>
-        <w:rPr>
-          <w:lang w:val="en_US" w:bidi="en_US"/>
-        </w:rPr>
-        <w:t xml:space="preserve">If you try to hang on to (literally </w:t>
+        <w:t>Mark 9:2–8</w:t>
+      </w:r>
+      <w:r>
+        <w:rPr>
+          <w:lang w:val="en_US" w:bidi="en_US"/>
+        </w:rPr>
+      </w:r>
+    </w:p>
+    <w:p>
+      <w:pPr>
+        <w:pStyle w:val="ListBullet"/>
+        <w:spacing w:line="240" w:lineRule="auto"/>
+        <w:ind w:left="720"/>
+      </w:pPr>
+      <w:r>
+        <w:rPr>
+          <w:lang w:val="en_US" w:bidi="en_US"/>
+        </w:rPr>
+      </w:r>
+      <w:r>
+        <w:rPr>
+          <w:lang w:val="en_US" w:bidi="en_US"/>
+        </w:rPr>
+        <w:t xml:space="preserve">This story is connected to </w:t>
+      </w:r>
+      <w:hyperlink r:id="rId568">
+        <w:r>
+          <w:rPr>
+            <w:lang w:val="en_US" w:bidi="en_US"/>
+          </w:rPr>
+          <w:rPr>
+            <w:color w:val="0000EE"/>
+            <w:u w:val="single"/>
+          </w:rPr>
+          <w:t>8:27–9:1</w:t>
+        </w:r>
+      </w:hyperlink>
+      <w:r>
+        <w:rPr>
+          <w:lang w:val="en_US" w:bidi="en_US"/>
+        </w:rPr>
+        <w:t xml:space="preserve"> both chronologically (</w:t>
       </w:r>
       <w:r>
         <w:rPr>
           <w:i/>
           <w:lang w:val="en_US" w:bidi="en_US"/>
         </w:rPr>
-        <w:t>save</w:t>
-      </w:r>
-      <w:r>
-        <w:rPr>
-          <w:lang w:val="en_US" w:bidi="en_US"/>
-        </w:rPr>
-        <w:t>) your life by keeping it from Jesus, you will lose it in the next world. But if you lose it to Jesus and his cause (the spread of the Good News), you will save it forever.</w:t>
+        <w:t>After six days</w:t>
+      </w:r>
+      <w:r>
+        <w:rPr>
+          <w:lang w:val="en_US" w:bidi="en_US"/>
+        </w:rPr>
+        <w:t>) and thematically (</w:t>
+      </w:r>
+      <w:hyperlink r:id="rId33">
+        <w:r>
+          <w:rPr>
+            <w:lang w:val="en_US" w:bidi="en_US"/>
+          </w:rPr>
+          <w:rPr>
+            <w:color w:val="0000EE"/>
+            <w:u w:val="single"/>
+          </w:rPr>
+          <w:t>9:7</w:t>
+        </w:r>
+      </w:hyperlink>
+      <w:r>
+        <w:rPr>
+          <w:lang w:val="en_US" w:bidi="en_US"/>
+        </w:rPr>
+        <w:t xml:space="preserve">). </w:t>
+      </w:r>
+    </w:p>
+    <w:p>
+      <w:pPr>
+        <w:pStyle w:val="ListBullet"/>
+        <w:spacing w:line="240" w:lineRule="auto"/>
+        <w:ind w:left="720"/>
+      </w:pPr>
+      <w:r>
+        <w:rPr>
+          <w:lang w:val="en_US" w:bidi="en_US"/>
+        </w:rPr>
+      </w:r>
+      <w:r>
+        <w:rPr>
+          <w:lang w:val="en_US" w:bidi="en_US"/>
+        </w:rPr>
+        <w:t xml:space="preserve">The presence of Peter, James, and John might be the fulfillment of “some standing here” in </w:t>
+      </w:r>
+      <w:hyperlink r:id="rId276">
+        <w:r>
+          <w:rPr>
+            <w:lang w:val="en_US" w:bidi="en_US"/>
+          </w:rPr>
+          <w:rPr>
+            <w:color w:val="0000EE"/>
+            <w:u w:val="single"/>
+          </w:rPr>
+          <w:t xml:space="preserve">9:1 </w:t>
+        </w:r>
+      </w:hyperlink>
+      <w:r>
+        <w:rPr>
+          <w:lang w:val="en_US" w:bidi="en_US"/>
+        </w:rPr>
+        <w:t xml:space="preserve">(see also </w:t>
+      </w:r>
+      <w:hyperlink r:id="rId569">
+        <w:r>
+          <w:rPr>
+            <w:lang w:val="en_US" w:bidi="en_US"/>
+          </w:rPr>
+          <w:rPr>
+            <w:color w:val="0000EE"/>
+            <w:u w:val="single"/>
+          </w:rPr>
+          <w:t>5:37</w:t>
+        </w:r>
+      </w:hyperlink>
+      <w:r>
+        <w:rPr>
+          <w:lang w:val="en_US" w:bidi="en_US"/>
+        </w:rPr>
+        <w:t xml:space="preserve">; </w:t>
+      </w:r>
+      <w:hyperlink r:id="rId570">
+        <w:r>
+          <w:rPr>
+            <w:lang w:val="en_US" w:bidi="en_US"/>
+          </w:rPr>
+          <w:rPr>
+            <w:color w:val="0000EE"/>
+            <w:u w:val="single"/>
+          </w:rPr>
+          <w:t>13:3</w:t>
+        </w:r>
+      </w:hyperlink>
+      <w:r>
+        <w:rPr>
+          <w:lang w:val="en_US" w:bidi="en_US"/>
+        </w:rPr>
+        <w:t xml:space="preserve">; </w:t>
+      </w:r>
+      <w:hyperlink r:id="rId364">
+        <w:r>
+          <w:rPr>
+            <w:lang w:val="en_US" w:bidi="en_US"/>
+          </w:rPr>
+          <w:rPr>
+            <w:color w:val="0000EE"/>
+            <w:u w:val="single"/>
+          </w:rPr>
+          <w:t>14:33</w:t>
+        </w:r>
+      </w:hyperlink>
+      <w:r>
+        <w:rPr>
+          <w:lang w:val="en_US" w:bidi="en_US"/>
+        </w:rPr>
+        <w:t>). Some interpreters believe that the Son of God’s glory before he became human (his pre-incarnate glory) shone through his human nature for a moment at the transfiguration (</w:t>
+      </w:r>
+      <w:hyperlink r:id="rId571">
+        <w:r>
+          <w:rPr>
+            <w:lang w:val="en_US" w:bidi="en_US"/>
+          </w:rPr>
+          <w:rPr>
+            <w:color w:val="0000EE"/>
+            <w:u w:val="single"/>
+          </w:rPr>
+          <w:t>John 1:14</w:t>
+        </w:r>
+      </w:hyperlink>
+      <w:r>
+        <w:rPr>
+          <w:lang w:val="en_US" w:bidi="en_US"/>
+        </w:rPr>
+        <w:t xml:space="preserve">; </w:t>
+      </w:r>
+      <w:hyperlink r:id="rId572">
+        <w:r>
+          <w:rPr>
+            <w:lang w:val="en_US" w:bidi="en_US"/>
+          </w:rPr>
+          <w:rPr>
+            <w:color w:val="0000EE"/>
+            <w:u w:val="single"/>
+          </w:rPr>
+          <w:t>17:5</w:t>
+        </w:r>
+      </w:hyperlink>
+      <w:r>
+        <w:rPr>
+          <w:lang w:val="en_US" w:bidi="en_US"/>
+        </w:rPr>
+        <w:t xml:space="preserve">). It is more likely that this event was an early glimpse of the Son of Man’s future glory (see </w:t>
+      </w:r>
+      <w:hyperlink r:id="rId573">
+        <w:r>
+          <w:rPr>
+            <w:lang w:val="en_US" w:bidi="en_US"/>
+          </w:rPr>
+          <w:rPr>
+            <w:color w:val="0000EE"/>
+            <w:u w:val="single"/>
+          </w:rPr>
+          <w:t>Matthew 16:28</w:t>
+        </w:r>
+      </w:hyperlink>
+      <w:r>
+        <w:rPr>
+          <w:lang w:val="en_US" w:bidi="en_US"/>
+        </w:rPr>
+        <w:t xml:space="preserve">; </w:t>
+      </w:r>
+      <w:hyperlink r:id="rId567">
+        <w:r>
+          <w:rPr>
+            <w:lang w:val="en_US" w:bidi="en_US"/>
+          </w:rPr>
+          <w:rPr>
+            <w:color w:val="0000EE"/>
+            <w:u w:val="single"/>
+          </w:rPr>
+          <w:t>2 Peter 1:16–18</w:t>
+        </w:r>
+      </w:hyperlink>
+      <w:r>
+        <w:rPr>
+          <w:lang w:val="en_US" w:bidi="en_US"/>
+        </w:rPr>
+        <w:t xml:space="preserve">; compare </w:t>
+      </w:r>
+      <w:hyperlink r:id="rId574">
+        <w:r>
+          <w:rPr>
+            <w:lang w:val="en_US" w:bidi="en_US"/>
+          </w:rPr>
+          <w:rPr>
+            <w:color w:val="0000EE"/>
+            <w:u w:val="single"/>
+          </w:rPr>
+          <w:t>Exodus 34:28–35</w:t>
+        </w:r>
+      </w:hyperlink>
+      <w:r>
+        <w:rPr>
+          <w:lang w:val="en_US" w:bidi="en_US"/>
+        </w:rPr>
+        <w:t xml:space="preserve">; </w:t>
+      </w:r>
+      <w:hyperlink r:id="rId575">
+        <w:r>
+          <w:rPr>
+            <w:lang w:val="en_US" w:bidi="en_US"/>
+          </w:rPr>
+          <w:rPr>
+            <w:color w:val="0000EE"/>
+            <w:u w:val="single"/>
+          </w:rPr>
+          <w:t>2 Corinthians 3:7–18</w:t>
+        </w:r>
+      </w:hyperlink>
+      <w:r>
+        <w:rPr>
+          <w:lang w:val="en_US" w:bidi="en_US"/>
+        </w:rPr>
+        <w:t>).</w:t>
       </w:r>
       <w:r>
         <w:rPr>
@@ -27749,26 +28612,62 @@
         <w:rPr>
           <w:lang w:val="en_US" w:bidi="en_US"/>
         </w:rPr>
-        <w:t>Mark 8:36–37</w:t>
-      </w:r>
-      <w:r>
-        <w:rPr>
-          <w:lang w:val="en_US" w:bidi="en_US"/>
-        </w:rPr>
-      </w:r>
-    </w:p>
-    <w:p>
-      <w:pPr/>
-      <w:r>
-        <w:rPr>
-          <w:lang w:val="en_US" w:bidi="en_US"/>
-        </w:rPr>
-      </w:r>
-      <w:r>
-        <w:rPr>
-          <w:lang w:val="en_US" w:bidi="en_US"/>
-        </w:rPr>
-        <w:t>The implied answer to Jesus’ rhetorical question is that possessing the entire world has no value if you give up eternal life. “He is no fool who gives what he cannot keep to gain that which he cannot lose” (Jim Elliot). You need your soul to enjoy the benefits of the world to come. When you forfeit your life or soul, there is nothing you can give to purchase it back.</w:t>
+        <w:t>Mark 9:4</w:t>
+      </w:r>
+      <w:r>
+        <w:rPr>
+          <w:lang w:val="en_US" w:bidi="en_US"/>
+        </w:rPr>
+      </w:r>
+    </w:p>
+    <w:p>
+      <w:pPr/>
+      <w:r>
+        <w:rPr>
+          <w:lang w:val="en_US" w:bidi="en_US"/>
+        </w:rPr>
+      </w:r>
+      <w:r>
+        <w:rPr>
+          <w:lang w:val="en_US" w:bidi="en_US"/>
+        </w:rPr>
+        <w:t xml:space="preserve">The appearance of Elijah and Moses might indicate the fulfillment of the law and the prophets in Jesus (see </w:t>
+      </w:r>
+      <w:hyperlink r:id="rId576">
+        <w:r>
+          <w:rPr>
+            <w:lang w:val="en_US" w:bidi="en_US"/>
+          </w:rPr>
+          <w:rPr>
+            <w:color w:val="0000EE"/>
+            <w:u w:val="single"/>
+          </w:rPr>
+          <w:t>Matthew 5:17</w:t>
+        </w:r>
+      </w:hyperlink>
+      <w:r>
+        <w:rPr>
+          <w:lang w:val="en_US" w:bidi="en_US"/>
+        </w:rPr>
+        <w:t xml:space="preserve">; compare </w:t>
+      </w:r>
+      <w:hyperlink r:id="rId577">
+        <w:r>
+          <w:rPr>
+            <w:lang w:val="en_US" w:bidi="en_US"/>
+          </w:rPr>
+          <w:rPr>
+            <w:color w:val="0000EE"/>
+            <w:u w:val="single"/>
+          </w:rPr>
+          <w:t>Malachi 4:4–5</w:t>
+        </w:r>
+      </w:hyperlink>
+      <w:r>
+        <w:rPr>
+          <w:lang w:val="en_US" w:bidi="en_US"/>
+        </w:rPr>
+        <w:t>).</w:t>
       </w:r>
       <w:r>
         <w:rPr>
@@ -27797,37 +28696,63 @@
         <w:rPr>
           <w:lang w:val="en_US" w:bidi="en_US"/>
         </w:rPr>
-        <w:t>Mark 8:38</w:t>
-      </w:r>
-      <w:r>
-        <w:rPr>
-          <w:lang w:val="en_US" w:bidi="en_US"/>
-        </w:rPr>
-      </w:r>
-    </w:p>
-    <w:p>
-      <w:pPr/>
-      <w:r>
-        <w:rPr>
-          <w:lang w:val="en_US" w:bidi="en_US"/>
-        </w:rPr>
-      </w:r>
-      <w:r>
-        <w:rPr>
-          <w:lang w:val="en_US" w:bidi="en_US"/>
-        </w:rPr>
-        <w:t xml:space="preserve">When Jesus, as the Son of Man, returns in glory to judge the world, he will be ashamed of those who were ashamed to be identified with him and his message (cp. </w:t>
-      </w:r>
-      <w:hyperlink r:id="rId560">
-        <w:r>
-          <w:rPr>
-            <w:lang w:val="en_US" w:bidi="en_US"/>
-          </w:rPr>
-          <w:rPr>
-            <w:color w:val="0000EE"/>
-            <w:u w:val="single"/>
-          </w:rPr>
-          <w:t>Matt 7:21–23</w:t>
+        <w:t>Mark 9:5–6</w:t>
+      </w:r>
+      <w:r>
+        <w:rPr>
+          <w:lang w:val="en_US" w:bidi="en_US"/>
+        </w:rPr>
+      </w:r>
+    </w:p>
+    <w:p>
+      <w:pPr/>
+      <w:r>
+        <w:rPr>
+          <w:lang w:val="en_US" w:bidi="en_US"/>
+        </w:rPr>
+      </w:r>
+      <w:r>
+        <w:rPr>
+          <w:lang w:val="en_US" w:bidi="en_US"/>
+        </w:rPr>
+        <w:t xml:space="preserve">The idea to </w:t>
+      </w:r>
+      <w:r>
+        <w:rPr>
+          <w:i/>
+          <w:lang w:val="en_US" w:bidi="en_US"/>
+        </w:rPr>
+        <w:t>put up</w:t>
+      </w:r>
+      <w:r>
+        <w:rPr>
+          <w:lang w:val="en_US" w:bidi="en_US"/>
+        </w:rPr>
+        <w:t xml:space="preserve"> </w:t>
+      </w:r>
+      <w:r>
+        <w:rPr>
+          <w:i/>
+          <w:lang w:val="en_US" w:bidi="en_US"/>
+        </w:rPr>
+        <w:t>three shelters</w:t>
+      </w:r>
+      <w:r>
+        <w:rPr>
+          <w:lang w:val="en_US" w:bidi="en_US"/>
+        </w:rPr>
+        <w:t xml:space="preserve"> as memorials treats Moses, Elijah, and Jesus as equals (see </w:t>
+      </w:r>
+      <w:hyperlink r:id="rId578">
+        <w:r>
+          <w:rPr>
+            <w:lang w:val="en_US" w:bidi="en_US"/>
+          </w:rPr>
+          <w:rPr>
+            <w:color w:val="0000EE"/>
+            <w:u w:val="single"/>
+          </w:rPr>
+          <w:t>Leviticus 23:33–43</w:t>
         </w:r>
       </w:hyperlink>
       <w:r>
@@ -27836,16 +28761,310 @@
         </w:rPr>
         <w:t xml:space="preserve">; </w:t>
       </w:r>
-      <w:hyperlink r:id="rId561">
-        <w:r>
-          <w:rPr>
-            <w:lang w:val="en_US" w:bidi="en_US"/>
-          </w:rPr>
-          <w:rPr>
-            <w:color w:val="0000EE"/>
-            <w:u w:val="single"/>
-          </w:rPr>
-          <w:t>10:32–33</w:t>
+      <w:hyperlink r:id="rId579">
+        <w:r>
+          <w:rPr>
+            <w:lang w:val="en_US" w:bidi="en_US"/>
+          </w:rPr>
+          <w:rPr>
+            <w:color w:val="0000EE"/>
+            <w:u w:val="single"/>
+          </w:rPr>
+          <w:t>Numbers 29:12–34</w:t>
+        </w:r>
+      </w:hyperlink>
+      <w:r>
+        <w:rPr>
+          <w:lang w:val="en_US" w:bidi="en_US"/>
+        </w:rPr>
+        <w:t>). But this idea ignored Peter’s earlier confession that Jesus is the Messiah (</w:t>
+      </w:r>
+      <w:hyperlink r:id="rId535">
+        <w:r>
+          <w:rPr>
+            <w:lang w:val="en_US" w:bidi="en_US"/>
+          </w:rPr>
+          <w:rPr>
+            <w:color w:val="0000EE"/>
+            <w:u w:val="single"/>
+          </w:rPr>
+          <w:t>Mark 8:29</w:t>
+        </w:r>
+      </w:hyperlink>
+      <w:r>
+        <w:rPr>
+          <w:lang w:val="en_US" w:bidi="en_US"/>
+        </w:rPr>
+        <w:t xml:space="preserve">). It also ignored that only Jesus had been transfigured (his appearance changed and showed his glory, </w:t>
+      </w:r>
+      <w:hyperlink r:id="rId580">
+        <w:r>
+          <w:rPr>
+            <w:lang w:val="en_US" w:bidi="en_US"/>
+          </w:rPr>
+          <w:rPr>
+            <w:color w:val="0000EE"/>
+            <w:u w:val="single"/>
+          </w:rPr>
+          <w:t>9:2–3</w:t>
+        </w:r>
+      </w:hyperlink>
+      <w:r>
+        <w:rPr>
+          <w:lang w:val="en_US" w:bidi="en_US"/>
+        </w:rPr>
+        <w:t>).</w:t>
+      </w:r>
+      <w:r>
+        <w:rPr>
+          <w:lang w:val="en_US" w:bidi="en_US"/>
+        </w:rPr>
+      </w:r>
+      <w:r>
+        <w:rPr>
+          <w:lang w:val="en_US" w:bidi="en_US"/>
+        </w:rPr>
+      </w:r>
+    </w:p>
+    <w:p>
+      <w:pPr/>
+      <w:r>
+        <w:rPr>
+          <w:lang w:val="en_US" w:bidi="en_US"/>
+        </w:rPr>
+      </w:r>
+    </w:p>
+    <w:p>
+      <w:pPr>
+        <w:pStyle w:val="Heading2"/>
+      </w:pPr>
+      <w:r>
+        <w:rPr>
+          <w:lang w:val="en_US" w:bidi="en_US"/>
+        </w:rPr>
+        <w:t>Mark 9:7</w:t>
+      </w:r>
+      <w:r>
+        <w:rPr>
+          <w:lang w:val="en_US" w:bidi="en_US"/>
+        </w:rPr>
+      </w:r>
+    </w:p>
+    <w:p>
+      <w:pPr>
+        <w:pStyle w:val="ListBullet"/>
+        <w:spacing w:line="240" w:lineRule="auto"/>
+        <w:ind w:left="720"/>
+      </w:pPr>
+      <w:r>
+        <w:rPr>
+          <w:lang w:val="en_US" w:bidi="en_US"/>
+        </w:rPr>
+      </w:r>
+      <w:r>
+        <w:rPr>
+          <w:i/>
+          <w:lang w:val="en_US" w:bidi="en_US"/>
+        </w:rPr>
+        <w:t>a cloud</w:t>
+      </w:r>
+      <w:r>
+        <w:rPr>
+          <w:lang w:val="en_US" w:bidi="en_US"/>
+        </w:rPr>
+        <w:t xml:space="preserve">: Compare </w:t>
+      </w:r>
+      <w:hyperlink r:id="rId581">
+        <w:r>
+          <w:rPr>
+            <w:lang w:val="en_US" w:bidi="en_US"/>
+          </w:rPr>
+          <w:rPr>
+            <w:color w:val="0000EE"/>
+            <w:u w:val="single"/>
+          </w:rPr>
+          <w:t>Exodus 40:34–35</w:t>
+        </w:r>
+      </w:hyperlink>
+      <w:r>
+        <w:rPr>
+          <w:lang w:val="en_US" w:bidi="en_US"/>
+        </w:rPr>
+        <w:t xml:space="preserve">. </w:t>
+      </w:r>
+    </w:p>
+    <w:p>
+      <w:pPr>
+        <w:pStyle w:val="ListBullet"/>
+        <w:spacing w:line="240" w:lineRule="auto"/>
+        <w:ind w:left="720"/>
+      </w:pPr>
+      <w:r>
+        <w:rPr>
+          <w:lang w:val="en_US" w:bidi="en_US"/>
+        </w:rPr>
+      </w:r>
+      <w:r>
+        <w:rPr>
+          <w:lang w:val="en_US" w:bidi="en_US"/>
+        </w:rPr>
+        <w:t xml:space="preserve">The voice from the cloud gave a strong correction to Peter’s suggestion: </w:t>
+      </w:r>
+      <w:r>
+        <w:rPr>
+          <w:i/>
+          <w:lang w:val="en_US" w:bidi="en_US"/>
+        </w:rPr>
+        <w:t>This is My beloved Son</w:t>
+      </w:r>
+      <w:r>
+        <w:rPr>
+          <w:lang w:val="en_US" w:bidi="en_US"/>
+        </w:rPr>
+        <w:t>. He is not equal to Moses and Elijah. God’s voice also confirmed what Peter had said earlier (</w:t>
+      </w:r>
+      <w:hyperlink r:id="rId535">
+        <w:r>
+          <w:rPr>
+            <w:lang w:val="en_US" w:bidi="en_US"/>
+          </w:rPr>
+          <w:rPr>
+            <w:color w:val="0000EE"/>
+            <w:u w:val="single"/>
+          </w:rPr>
+          <w:t>Mark 8:29</w:t>
+        </w:r>
+      </w:hyperlink>
+      <w:r>
+        <w:rPr>
+          <w:lang w:val="en_US" w:bidi="en_US"/>
+        </w:rPr>
+        <w:t>). At the same time, it gently corrected Peter for rejecting the prediction Jesus made about his suffering (</w:t>
+      </w:r>
+      <w:hyperlink r:id="rId582">
+        <w:r>
+          <w:rPr>
+            <w:lang w:val="en_US" w:bidi="en_US"/>
+          </w:rPr>
+          <w:rPr>
+            <w:color w:val="0000EE"/>
+            <w:u w:val="single"/>
+          </w:rPr>
+          <w:t>8:32</w:t>
+        </w:r>
+      </w:hyperlink>
+      <w:r>
+        <w:rPr>
+          <w:lang w:val="en_US" w:bidi="en_US"/>
+        </w:rPr>
+        <w:t>). God told Peter and the other disciples to listen to Jesus.</w:t>
+      </w:r>
+      <w:r>
+        <w:rPr>
+          <w:lang w:val="en_US" w:bidi="en_US"/>
+        </w:rPr>
+      </w:r>
+      <w:r>
+        <w:rPr>
+          <w:lang w:val="en_US" w:bidi="en_US"/>
+        </w:rPr>
+      </w:r>
+    </w:p>
+    <w:p>
+      <w:pPr/>
+      <w:r>
+        <w:rPr>
+          <w:lang w:val="en_US" w:bidi="en_US"/>
+        </w:rPr>
+      </w:r>
+    </w:p>
+    <w:p>
+      <w:pPr>
+        <w:pStyle w:val="Heading2"/>
+      </w:pPr>
+      <w:r>
+        <w:rPr>
+          <w:lang w:val="en_US" w:bidi="en_US"/>
+        </w:rPr>
+        <w:t>Mark 9:8</w:t>
+      </w:r>
+      <w:r>
+        <w:rPr>
+          <w:lang w:val="en_US" w:bidi="en_US"/>
+        </w:rPr>
+      </w:r>
+    </w:p>
+    <w:p>
+      <w:pPr/>
+      <w:r>
+        <w:rPr>
+          <w:lang w:val="en_US" w:bidi="en_US"/>
+        </w:rPr>
+      </w:r>
+      <w:r>
+        <w:rPr>
+          <w:lang w:val="en_US" w:bidi="en_US"/>
+        </w:rPr>
+        <w:t>Only Jesus remained, not Moses or Elijah. Jesus was clearly superior to Elijah and Moses.</w:t>
+      </w:r>
+      <w:r>
+        <w:rPr>
+          <w:lang w:val="en_US" w:bidi="en_US"/>
+        </w:rPr>
+      </w:r>
+      <w:r>
+        <w:rPr>
+          <w:lang w:val="en_US" w:bidi="en_US"/>
+        </w:rPr>
+      </w:r>
+    </w:p>
+    <w:p>
+      <w:pPr/>
+      <w:r>
+        <w:rPr>
+          <w:lang w:val="en_US" w:bidi="en_US"/>
+        </w:rPr>
+      </w:r>
+    </w:p>
+    <w:p>
+      <w:pPr>
+        <w:pStyle w:val="Heading2"/>
+      </w:pPr>
+      <w:r>
+        <w:rPr>
+          <w:lang w:val="en_US" w:bidi="en_US"/>
+        </w:rPr>
+        <w:t>Mark 9:9</w:t>
+      </w:r>
+      <w:r>
+        <w:rPr>
+          <w:lang w:val="en_US" w:bidi="en_US"/>
+        </w:rPr>
+      </w:r>
+    </w:p>
+    <w:p>
+      <w:pPr/>
+      <w:r>
+        <w:rPr>
+          <w:lang w:val="en_US" w:bidi="en_US"/>
+        </w:rPr>
+      </w:r>
+      <w:r>
+        <w:rPr>
+          <w:lang w:val="en_US" w:bidi="en_US"/>
+        </w:rPr>
+        <w:t xml:space="preserve">Secrecy would no longer be needed after the Son of Man had risen from the dead. At that point, people would understand that Jesus the Messiah (God's chosen king) did not come as a political or military leader. Because of this, his message could be announced openly to everyone (see </w:t>
+      </w:r>
+      <w:hyperlink r:id="rId583">
+        <w:r>
+          <w:rPr>
+            <w:lang w:val="en_US" w:bidi="en_US"/>
+          </w:rPr>
+          <w:rPr>
+            <w:color w:val="0000EE"/>
+            <w:u w:val="single"/>
+          </w:rPr>
+          <w:t>Acts 2:36</w:t>
         </w:r>
       </w:hyperlink>
       <w:r>
@@ -27854,16 +29073,179 @@
         </w:rPr>
         <w:t xml:space="preserve">; </w:t>
       </w:r>
-      <w:hyperlink r:id="rId562">
-        <w:r>
-          <w:rPr>
-            <w:lang w:val="en_US" w:bidi="en_US"/>
-          </w:rPr>
-          <w:rPr>
-            <w:color w:val="0000EE"/>
-            <w:u w:val="single"/>
-          </w:rPr>
-          <w:t>Luke 12:8–9</w:t>
+      <w:hyperlink r:id="rId584">
+        <w:r>
+          <w:rPr>
+            <w:lang w:val="en_US" w:bidi="en_US"/>
+          </w:rPr>
+          <w:rPr>
+            <w:color w:val="0000EE"/>
+            <w:u w:val="single"/>
+          </w:rPr>
+          <w:t>3:6</w:t>
+        </w:r>
+      </w:hyperlink>
+      <w:r>
+        <w:rPr>
+          <w:lang w:val="en_US" w:bidi="en_US"/>
+        </w:rPr>
+        <w:t>).</w:t>
+      </w:r>
+      <w:r>
+        <w:rPr>
+          <w:lang w:val="en_US" w:bidi="en_US"/>
+        </w:rPr>
+      </w:r>
+      <w:r>
+        <w:rPr>
+          <w:lang w:val="en_US" w:bidi="en_US"/>
+        </w:rPr>
+      </w:r>
+    </w:p>
+    <w:p>
+      <w:pPr/>
+      <w:r>
+        <w:rPr>
+          <w:lang w:val="en_US" w:bidi="en_US"/>
+        </w:rPr>
+      </w:r>
+    </w:p>
+    <w:p>
+      <w:pPr>
+        <w:pStyle w:val="Heading2"/>
+      </w:pPr>
+      <w:r>
+        <w:rPr>
+          <w:lang w:val="en_US" w:bidi="en_US"/>
+        </w:rPr>
+        <w:t>Mark 9:10</w:t>
+      </w:r>
+      <w:r>
+        <w:rPr>
+          <w:lang w:val="en_US" w:bidi="en_US"/>
+        </w:rPr>
+      </w:r>
+    </w:p>
+    <w:p>
+      <w:pPr/>
+      <w:r>
+        <w:rPr>
+          <w:lang w:val="en_US" w:bidi="en_US"/>
+        </w:rPr>
+      </w:r>
+      <w:r>
+        <w:rPr>
+          <w:lang w:val="en_US" w:bidi="en_US"/>
+        </w:rPr>
+        <w:t xml:space="preserve">The three disciples only understood what Jesus meant by </w:t>
+      </w:r>
+      <w:r>
+        <w:rPr>
+          <w:i/>
+          <w:lang w:val="en_US" w:bidi="en_US"/>
+        </w:rPr>
+        <w:t>rise from the dead</w:t>
+      </w:r>
+      <w:r>
+        <w:rPr>
+          <w:lang w:val="en_US" w:bidi="en_US"/>
+        </w:rPr>
+        <w:t xml:space="preserve"> after it happened.</w:t>
+      </w:r>
+      <w:r>
+        <w:rPr>
+          <w:lang w:val="en_US" w:bidi="en_US"/>
+        </w:rPr>
+      </w:r>
+      <w:r>
+        <w:rPr>
+          <w:lang w:val="en_US" w:bidi="en_US"/>
+        </w:rPr>
+      </w:r>
+    </w:p>
+    <w:p>
+      <w:pPr/>
+      <w:r>
+        <w:rPr>
+          <w:lang w:val="en_US" w:bidi="en_US"/>
+        </w:rPr>
+      </w:r>
+    </w:p>
+    <w:p>
+      <w:pPr>
+        <w:pStyle w:val="Heading2"/>
+      </w:pPr>
+      <w:r>
+        <w:rPr>
+          <w:lang w:val="en_US" w:bidi="en_US"/>
+        </w:rPr>
+        <w:t>Mark 9:11</w:t>
+      </w:r>
+      <w:r>
+        <w:rPr>
+          <w:lang w:val="en_US" w:bidi="en_US"/>
+        </w:rPr>
+      </w:r>
+    </w:p>
+    <w:p>
+      <w:pPr/>
+      <w:r>
+        <w:rPr>
+          <w:lang w:val="en_US" w:bidi="en_US"/>
+        </w:rPr>
+      </w:r>
+      <w:r>
+        <w:rPr>
+          <w:lang w:val="en_US" w:bidi="en_US"/>
+        </w:rPr>
+        <w:t xml:space="preserve">The disciples wanted to understand the prophecy that Elijah must come first before the Messiah (see </w:t>
+      </w:r>
+      <w:hyperlink r:id="rId398">
+        <w:r>
+          <w:rPr>
+            <w:lang w:val="en_US" w:bidi="en_US"/>
+          </w:rPr>
+          <w:rPr>
+            <w:color w:val="0000EE"/>
+            <w:u w:val="single"/>
+          </w:rPr>
+          <w:t>Malachi 4:5–6</w:t>
+        </w:r>
+      </w:hyperlink>
+      <w:r>
+        <w:rPr>
+          <w:lang w:val="en_US" w:bidi="en_US"/>
+        </w:rPr>
+        <w:t>). They wondered how this prophecy fit with the teachings of Jesus about God's kingdom and his own death, resurrection, and second coming (</w:t>
+      </w:r>
+      <w:hyperlink r:id="rId397">
+        <w:r>
+          <w:rPr>
+            <w:lang w:val="en_US" w:bidi="en_US"/>
+          </w:rPr>
+          <w:rPr>
+            <w:color w:val="0000EE"/>
+            <w:u w:val="single"/>
+          </w:rPr>
+          <w:t>Mark 8:31</w:t>
+        </w:r>
+      </w:hyperlink>
+      <w:r>
+        <w:rPr>
+          <w:lang w:val="en_US" w:bidi="en_US"/>
+        </w:rPr>
+        <w:t xml:space="preserve">, </w:t>
+      </w:r>
+      <w:hyperlink r:id="rId524">
+        <w:r>
+          <w:rPr>
+            <w:lang w:val="en_US" w:bidi="en_US"/>
+          </w:rPr>
+          <w:rPr>
+            <w:color w:val="0000EE"/>
+            <w:u w:val="single"/>
+          </w:rPr>
+          <w:t>38</w:t>
         </w:r>
       </w:hyperlink>
       <w:r>
@@ -27872,16 +29254,16 @@
         </w:rPr>
         <w:t xml:space="preserve">; </w:t>
       </w:r>
-      <w:hyperlink r:id="rId563">
-        <w:r>
-          <w:rPr>
-            <w:lang w:val="en_US" w:bidi="en_US"/>
-          </w:rPr>
-          <w:rPr>
-            <w:color w:val="0000EE"/>
-            <w:u w:val="single"/>
-          </w:rPr>
-          <w:t>2 Tim 2:12</w:t>
+      <w:hyperlink r:id="rId134">
+        <w:r>
+          <w:rPr>
+            <w:lang w:val="en_US" w:bidi="en_US"/>
+          </w:rPr>
+          <w:rPr>
+            <w:color w:val="0000EE"/>
+            <w:u w:val="single"/>
+          </w:rPr>
+          <w:t>9:9</w:t>
         </w:r>
       </w:hyperlink>
       <w:r>
@@ -27917,91 +29299,55 @@
         <w:rPr>
           <w:lang w:val="en_US" w:bidi="en_US"/>
         </w:rPr>
-        <w:t>Mark 9:1</w:t>
-      </w:r>
-      <w:r>
-        <w:rPr>
-          <w:lang w:val="en_US" w:bidi="en_US"/>
-        </w:rPr>
-      </w:r>
-    </w:p>
-    <w:p>
-      <w:pPr/>
-      <w:r>
-        <w:rPr>
-          <w:lang w:val="en_US" w:bidi="en_US"/>
-        </w:rPr>
-      </w:r>
-      <w:r>
-        <w:rPr>
-          <w:lang w:val="en_US" w:bidi="en_US"/>
-        </w:rPr>
-        <w:t xml:space="preserve">The introductory I tell you the truth indicates that the promise in this verse is important, but the meaning of the promise is much debated. It might suggest that some of the disciples will (1) witness Jesus’ resurrection from the dead (ch </w:t>
-      </w:r>
-      <w:hyperlink r:id="rId564">
-        <w:r>
-          <w:rPr>
-            <w:lang w:val="en_US" w:bidi="en_US"/>
-          </w:rPr>
-          <w:rPr>
-            <w:color w:val="0000EE"/>
-            <w:u w:val="single"/>
-          </w:rPr>
-          <w:t>16</w:t>
-        </w:r>
-      </w:hyperlink>
-      <w:r>
-        <w:rPr>
-          <w:lang w:val="en_US" w:bidi="en_US"/>
-        </w:rPr>
-        <w:t>); (2) experience the coming of the Spirit upon the church (</w:t>
-      </w:r>
-      <w:hyperlink r:id="rId565">
-        <w:r>
-          <w:rPr>
-            <w:lang w:val="en_US" w:bidi="en_US"/>
-          </w:rPr>
-          <w:rPr>
-            <w:color w:val="0000EE"/>
-            <w:u w:val="single"/>
-          </w:rPr>
-          <w:t>Acts 2</w:t>
-        </w:r>
-      </w:hyperlink>
-      <w:r>
-        <w:rPr>
-          <w:lang w:val="en_US" w:bidi="en_US"/>
-        </w:rPr>
-        <w:t>); (3) see the fall of Jerusalem in AD 70; or (4) witness Jesus’ transfiguration as a foretaste of God’s coming Kingdom. Mark’s placement of the promise right before the transfiguration account (</w:t>
-      </w:r>
-      <w:hyperlink r:id="rId566">
-        <w:r>
-          <w:rPr>
-            <w:lang w:val="en_US" w:bidi="en_US"/>
-          </w:rPr>
-          <w:rPr>
-            <w:color w:val="0000EE"/>
-            <w:u w:val="single"/>
-          </w:rPr>
-          <w:t>Mark 9:2–8</w:t>
-        </w:r>
-      </w:hyperlink>
-      <w:r>
-        <w:rPr>
-          <w:lang w:val="en_US" w:bidi="en_US"/>
-        </w:rPr>
-        <w:t xml:space="preserve">) indicates that he probably meant the transfiguration as the fulfillment (see </w:t>
-      </w:r>
-      <w:hyperlink r:id="rId567">
-        <w:r>
-          <w:rPr>
-            <w:lang w:val="en_US" w:bidi="en_US"/>
-          </w:rPr>
-          <w:rPr>
-            <w:color w:val="0000EE"/>
-            <w:u w:val="single"/>
-          </w:rPr>
-          <w:t>2 Pet 1:16–18</w:t>
+        <w:t>Mark 9:12</w:t>
+      </w:r>
+      <w:r>
+        <w:rPr>
+          <w:lang w:val="en_US" w:bidi="en_US"/>
+        </w:rPr>
+      </w:r>
+    </w:p>
+    <w:p>
+      <w:pPr/>
+      <w:r>
+        <w:rPr>
+          <w:lang w:val="en_US" w:bidi="en_US"/>
+        </w:rPr>
+      </w:r>
+      <w:r>
+        <w:rPr>
+          <w:lang w:val="en_US" w:bidi="en_US"/>
+        </w:rPr>
+        <w:t xml:space="preserve">The teachers of the law were correct that Elijah must come before the completion of God’s kingdom (the time when God fully establishes his rule). But Scripture also says that the Son of Man must suffer greatly (for example, </w:t>
+      </w:r>
+      <w:hyperlink r:id="rId585">
+        <w:r>
+          <w:rPr>
+            <w:lang w:val="en_US" w:bidi="en_US"/>
+          </w:rPr>
+          <w:rPr>
+            <w:color w:val="0000EE"/>
+            <w:u w:val="single"/>
+          </w:rPr>
+          <w:t>Psalm 22</w:t>
+        </w:r>
+      </w:hyperlink>
+      <w:r>
+        <w:rPr>
+          <w:lang w:val="en_US" w:bidi="en_US"/>
+        </w:rPr>
+        <w:t xml:space="preserve">; </w:t>
+      </w:r>
+      <w:hyperlink r:id="rId586">
+        <w:r>
+          <w:rPr>
+            <w:lang w:val="en_US" w:bidi="en_US"/>
+          </w:rPr>
+          <w:rPr>
+            <w:color w:val="0000EE"/>
+            <w:u w:val="single"/>
+          </w:rPr>
+          <w:t>Isaiah 52:13–53:12</w:t>
         </w:r>
       </w:hyperlink>
       <w:r>
@@ -28037,73 +29383,187 @@
         <w:rPr>
           <w:lang w:val="en_US" w:bidi="en_US"/>
         </w:rPr>
-        <w:t>Mark 9:2–8</w:t>
-      </w:r>
-      <w:r>
-        <w:rPr>
-          <w:lang w:val="en_US" w:bidi="en_US"/>
-        </w:rPr>
-      </w:r>
-    </w:p>
-    <w:p>
-      <w:pPr/>
-      <w:r>
-        <w:rPr>
-          <w:lang w:val="en_US" w:bidi="en_US"/>
-        </w:rPr>
-      </w:r>
-      <w:r>
-        <w:rPr>
-          <w:lang w:val="en_US" w:bidi="en_US"/>
-        </w:rPr>
-        <w:t xml:space="preserve">This account is tied to </w:t>
-      </w:r>
-      <w:hyperlink r:id="rId568">
-        <w:r>
-          <w:rPr>
-            <w:lang w:val="en_US" w:bidi="en_US"/>
-          </w:rPr>
-          <w:rPr>
-            <w:color w:val="0000EE"/>
-            <w:u w:val="single"/>
-          </w:rPr>
-          <w:t>8:27–9:1</w:t>
-        </w:r>
-      </w:hyperlink>
-      <w:r>
-        <w:rPr>
-          <w:lang w:val="en_US" w:bidi="en_US"/>
-        </w:rPr>
-        <w:t xml:space="preserve"> both chronologically (six days later) and thematically (</w:t>
-      </w:r>
-      <w:hyperlink r:id="rId33">
-        <w:r>
-          <w:rPr>
-            <w:lang w:val="en_US" w:bidi="en_US"/>
-          </w:rPr>
-          <w:rPr>
-            <w:color w:val="0000EE"/>
-            <w:u w:val="single"/>
-          </w:rPr>
-          <w:t>9:7</w:t>
-        </w:r>
-      </w:hyperlink>
-      <w:r>
-        <w:rPr>
-          <w:lang w:val="en_US" w:bidi="en_US"/>
-        </w:rPr>
-        <w:t xml:space="preserve">). • The presence of Peter, James, and John (see also </w:t>
-      </w:r>
-      <w:hyperlink r:id="rId569">
-        <w:r>
-          <w:rPr>
-            <w:lang w:val="en_US" w:bidi="en_US"/>
-          </w:rPr>
-          <w:rPr>
-            <w:color w:val="0000EE"/>
-            <w:u w:val="single"/>
-          </w:rPr>
-          <w:t>5:37</w:t>
+        <w:t>Mark 9:13</w:t>
+      </w:r>
+      <w:r>
+        <w:rPr>
+          <w:lang w:val="en_US" w:bidi="en_US"/>
+        </w:rPr>
+      </w:r>
+    </w:p>
+    <w:p>
+      <w:pPr/>
+      <w:r>
+        <w:rPr>
+          <w:lang w:val="en_US" w:bidi="en_US"/>
+        </w:rPr>
+      </w:r>
+      <w:r>
+        <w:rPr>
+          <w:lang w:val="en_US" w:bidi="en_US"/>
+        </w:rPr>
+        <w:t xml:space="preserve">The teachers of the law made a mistake by not realizing that Elijah had already come (see </w:t>
+      </w:r>
+      <w:hyperlink r:id="rId587">
+        <w:r>
+          <w:rPr>
+            <w:lang w:val="en_US" w:bidi="en_US"/>
+          </w:rPr>
+          <w:rPr>
+            <w:color w:val="0000EE"/>
+            <w:u w:val="single"/>
+          </w:rPr>
+          <w:t>Matthew 17:11–13</w:t>
+        </w:r>
+      </w:hyperlink>
+      <w:r>
+        <w:rPr>
+          <w:lang w:val="en_US" w:bidi="en_US"/>
+        </w:rPr>
+        <w:t xml:space="preserve">; compare </w:t>
+      </w:r>
+      <w:hyperlink r:id="rId398">
+        <w:r>
+          <w:rPr>
+            <w:lang w:val="en_US" w:bidi="en_US"/>
+          </w:rPr>
+          <w:rPr>
+            <w:color w:val="0000EE"/>
+            <w:u w:val="single"/>
+          </w:rPr>
+          <w:t>Malachi 4:5–6</w:t>
+        </w:r>
+      </w:hyperlink>
+      <w:r>
+        <w:rPr>
+          <w:lang w:val="en_US" w:bidi="en_US"/>
+        </w:rPr>
+        <w:t>). Because of this, they did not recognize that the kingdom of God had already arrived. They also failed to realize that the Messiah's suffering and death, which were predicted in Scripture, were about to take place.</w:t>
+      </w:r>
+      <w:r>
+        <w:rPr>
+          <w:lang w:val="en_US" w:bidi="en_US"/>
+        </w:rPr>
+      </w:r>
+      <w:r>
+        <w:rPr>
+          <w:lang w:val="en_US" w:bidi="en_US"/>
+        </w:rPr>
+      </w:r>
+    </w:p>
+    <w:p>
+      <w:pPr/>
+      <w:r>
+        <w:rPr>
+          <w:lang w:val="en_US" w:bidi="en_US"/>
+        </w:rPr>
+      </w:r>
+    </w:p>
+    <w:p>
+      <w:pPr>
+        <w:pStyle w:val="Heading2"/>
+      </w:pPr>
+      <w:r>
+        <w:rPr>
+          <w:lang w:val="en_US" w:bidi="en_US"/>
+        </w:rPr>
+        <w:t>Mark 9:14</w:t>
+      </w:r>
+      <w:r>
+        <w:rPr>
+          <w:lang w:val="en_US" w:bidi="en_US"/>
+        </w:rPr>
+      </w:r>
+    </w:p>
+    <w:p>
+      <w:pPr/>
+      <w:r>
+        <w:rPr>
+          <w:lang w:val="en_US" w:bidi="en_US"/>
+        </w:rPr>
+      </w:r>
+      <w:r>
+        <w:rPr>
+          <w:lang w:val="en_US" w:bidi="en_US"/>
+        </w:rPr>
+        <w:t>Jesus and the three disciples (Peter, James, and John) returned to the other disciples, the crowd, and the teachers of the law. This event is similar to when Moses came down from Mount Sinai to join the people of Israel (</w:t>
+      </w:r>
+      <w:hyperlink r:id="rId588">
+        <w:r>
+          <w:rPr>
+            <w:lang w:val="en_US" w:bidi="en_US"/>
+          </w:rPr>
+          <w:rPr>
+            <w:color w:val="0000EE"/>
+            <w:u w:val="single"/>
+          </w:rPr>
+          <w:t>Exodus 34:29–35</w:t>
+        </w:r>
+      </w:hyperlink>
+      <w:r>
+        <w:rPr>
+          <w:lang w:val="en_US" w:bidi="en_US"/>
+        </w:rPr>
+        <w:t>).</w:t>
+      </w:r>
+      <w:r>
+        <w:rPr>
+          <w:lang w:val="en_US" w:bidi="en_US"/>
+        </w:rPr>
+      </w:r>
+      <w:r>
+        <w:rPr>
+          <w:lang w:val="en_US" w:bidi="en_US"/>
+        </w:rPr>
+      </w:r>
+    </w:p>
+    <w:p>
+      <w:pPr/>
+      <w:r>
+        <w:rPr>
+          <w:lang w:val="en_US" w:bidi="en_US"/>
+        </w:rPr>
+      </w:r>
+    </w:p>
+    <w:p>
+      <w:pPr>
+        <w:pStyle w:val="Heading2"/>
+      </w:pPr>
+      <w:r>
+        <w:rPr>
+          <w:lang w:val="en_US" w:bidi="en_US"/>
+        </w:rPr>
+        <w:t>Mark 9:14–29</w:t>
+      </w:r>
+      <w:r>
+        <w:rPr>
+          <w:lang w:val="en_US" w:bidi="en_US"/>
+        </w:rPr>
+      </w:r>
+    </w:p>
+    <w:p>
+      <w:pPr/>
+      <w:r>
+        <w:rPr>
+          <w:lang w:val="en_US" w:bidi="en_US"/>
+        </w:rPr>
+      </w:r>
+      <w:r>
+        <w:rPr>
+          <w:lang w:val="en_US" w:bidi="en_US"/>
+        </w:rPr>
+        <w:t>This is the fourth and final time Jesus drives out demons in Mark's Gospel (</w:t>
+      </w:r>
+      <w:hyperlink r:id="rId345">
+        <w:r>
+          <w:rPr>
+            <w:lang w:val="en_US" w:bidi="en_US"/>
+          </w:rPr>
+          <w:rPr>
+            <w:color w:val="0000EE"/>
+            <w:u w:val="single"/>
+          </w:rPr>
+          <w:t>1:21–28</w:t>
         </w:r>
       </w:hyperlink>
       <w:r>
@@ -28112,16 +29572,16 @@
         </w:rPr>
         <w:t xml:space="preserve">; </w:t>
       </w:r>
-      <w:hyperlink r:id="rId570">
-        <w:r>
-          <w:rPr>
-            <w:lang w:val="en_US" w:bidi="en_US"/>
-          </w:rPr>
-          <w:rPr>
-            <w:color w:val="0000EE"/>
-            <w:u w:val="single"/>
-          </w:rPr>
-          <w:t>13:3</w:t>
+      <w:hyperlink r:id="rId76">
+        <w:r>
+          <w:rPr>
+            <w:lang w:val="en_US" w:bidi="en_US"/>
+          </w:rPr>
+          <w:rPr>
+            <w:color w:val="0000EE"/>
+            <w:u w:val="single"/>
+          </w:rPr>
+          <w:t>5:1–20</w:t>
         </w:r>
       </w:hyperlink>
       <w:r>
@@ -28130,52 +29590,34 @@
         </w:rPr>
         <w:t xml:space="preserve">; </w:t>
       </w:r>
-      <w:hyperlink r:id="rId364">
-        <w:r>
-          <w:rPr>
-            <w:lang w:val="en_US" w:bidi="en_US"/>
-          </w:rPr>
-          <w:rPr>
-            <w:color w:val="0000EE"/>
-            <w:u w:val="single"/>
-          </w:rPr>
-          <w:t>14:33</w:t>
-        </w:r>
-      </w:hyperlink>
-      <w:r>
-        <w:rPr>
-          <w:lang w:val="en_US" w:bidi="en_US"/>
-        </w:rPr>
-        <w:t xml:space="preserve">) might be the fulfillment of </w:t>
-      </w:r>
-      <w:hyperlink r:id="rId276">
-        <w:r>
-          <w:rPr>
-            <w:lang w:val="en_US" w:bidi="en_US"/>
-          </w:rPr>
-          <w:rPr>
-            <w:color w:val="0000EE"/>
-            <w:u w:val="single"/>
-          </w:rPr>
-          <w:t>9:1</w:t>
-        </w:r>
-      </w:hyperlink>
-      <w:r>
-        <w:rPr>
-          <w:lang w:val="en_US" w:bidi="en_US"/>
-        </w:rPr>
-        <w:t xml:space="preserve"> (“some standing here”). Some interpreters believe that the pre-incarnate glory of the Son of God broke through the veil of his humanity (</w:t>
-      </w:r>
-      <w:hyperlink r:id="rId571">
-        <w:r>
-          <w:rPr>
-            <w:lang w:val="en_US" w:bidi="en_US"/>
-          </w:rPr>
-          <w:rPr>
-            <w:color w:val="0000EE"/>
-            <w:u w:val="single"/>
-          </w:rPr>
-          <w:t>John 1:14</w:t>
+      <w:hyperlink r:id="rId112">
+        <w:r>
+          <w:rPr>
+            <w:lang w:val="en_US" w:bidi="en_US"/>
+          </w:rPr>
+          <w:rPr>
+            <w:color w:val="0000EE"/>
+            <w:u w:val="single"/>
+          </w:rPr>
+          <w:t>7:24–30</w:t>
+        </w:r>
+      </w:hyperlink>
+      <w:r>
+        <w:rPr>
+          <w:lang w:val="en_US" w:bidi="en_US"/>
+        </w:rPr>
+        <w:t xml:space="preserve">). The disciples could not drive out the demon, so Jesus performed the exorcism. This emphasizes the need for faith (see </w:t>
+      </w:r>
+      <w:hyperlink r:id="rId375">
+        <w:r>
+          <w:rPr>
+            <w:lang w:val="en_US" w:bidi="en_US"/>
+          </w:rPr>
+          <w:rPr>
+            <w:color w:val="0000EE"/>
+            <w:u w:val="single"/>
+          </w:rPr>
+          <w:t>2:5</w:t>
         </w:r>
       </w:hyperlink>
       <w:r>
@@ -28184,34 +29626,16 @@
         </w:rPr>
         <w:t xml:space="preserve">; </w:t>
       </w:r>
-      <w:hyperlink r:id="rId572">
-        <w:r>
-          <w:rPr>
-            <w:lang w:val="en_US" w:bidi="en_US"/>
-          </w:rPr>
-          <w:rPr>
-            <w:color w:val="0000EE"/>
-            <w:u w:val="single"/>
-          </w:rPr>
-          <w:t>17:5</w:t>
-        </w:r>
-      </w:hyperlink>
-      <w:r>
-        <w:rPr>
-          <w:lang w:val="en_US" w:bidi="en_US"/>
-        </w:rPr>
-        <w:t xml:space="preserve">) at the transfiguration. It is more likely that this event was an advance glimpse of the Son of Man’s future glory (see </w:t>
-      </w:r>
-      <w:hyperlink r:id="rId573">
-        <w:r>
-          <w:rPr>
-            <w:lang w:val="en_US" w:bidi="en_US"/>
-          </w:rPr>
-          <w:rPr>
-            <w:color w:val="0000EE"/>
-            <w:u w:val="single"/>
-          </w:rPr>
-          <w:t>Matt 16:28</w:t>
+      <w:hyperlink r:id="rId352">
+        <w:r>
+          <w:rPr>
+            <w:lang w:val="en_US" w:bidi="en_US"/>
+          </w:rPr>
+          <w:rPr>
+            <w:color w:val="0000EE"/>
+            <w:u w:val="single"/>
+          </w:rPr>
+          <w:t>5:34</w:t>
         </w:r>
       </w:hyperlink>
       <w:r>
@@ -28220,1090 +29644,6 @@
         </w:rPr>
         <w:t xml:space="preserve">; </w:t>
       </w:r>
-      <w:hyperlink r:id="rId567">
-        <w:r>
-          <w:rPr>
-            <w:lang w:val="en_US" w:bidi="en_US"/>
-          </w:rPr>
-          <w:rPr>
-            <w:color w:val="0000EE"/>
-            <w:u w:val="single"/>
-          </w:rPr>
-          <w:t>2 Pet 1:16–18</w:t>
-        </w:r>
-      </w:hyperlink>
-      <w:r>
-        <w:rPr>
-          <w:lang w:val="en_US" w:bidi="en_US"/>
-        </w:rPr>
-        <w:t xml:space="preserve">; cp. </w:t>
-      </w:r>
-      <w:hyperlink r:id="rId574">
-        <w:r>
-          <w:rPr>
-            <w:lang w:val="en_US" w:bidi="en_US"/>
-          </w:rPr>
-          <w:rPr>
-            <w:color w:val="0000EE"/>
-            <w:u w:val="single"/>
-          </w:rPr>
-          <w:t>Exod 34:28–35</w:t>
-        </w:r>
-      </w:hyperlink>
-      <w:r>
-        <w:rPr>
-          <w:lang w:val="en_US" w:bidi="en_US"/>
-        </w:rPr>
-        <w:t xml:space="preserve">; </w:t>
-      </w:r>
-      <w:hyperlink r:id="rId575">
-        <w:r>
-          <w:rPr>
-            <w:lang w:val="en_US" w:bidi="en_US"/>
-          </w:rPr>
-          <w:rPr>
-            <w:color w:val="0000EE"/>
-            <w:u w:val="single"/>
-          </w:rPr>
-          <w:t>2 Cor 3:7–18</w:t>
-        </w:r>
-      </w:hyperlink>
-      <w:r>
-        <w:rPr>
-          <w:lang w:val="en_US" w:bidi="en_US"/>
-        </w:rPr>
-        <w:t>).</w:t>
-      </w:r>
-      <w:r>
-        <w:rPr>
-          <w:lang w:val="en_US" w:bidi="en_US"/>
-        </w:rPr>
-      </w:r>
-      <w:r>
-        <w:rPr>
-          <w:lang w:val="en_US" w:bidi="en_US"/>
-        </w:rPr>
-      </w:r>
-    </w:p>
-    <w:p>
-      <w:pPr/>
-      <w:r>
-        <w:rPr>
-          <w:lang w:val="en_US" w:bidi="en_US"/>
-        </w:rPr>
-      </w:r>
-    </w:p>
-    <w:p>
-      <w:pPr>
-        <w:pStyle w:val="Heading2"/>
-      </w:pPr>
-      <w:r>
-        <w:rPr>
-          <w:lang w:val="en_US" w:bidi="en_US"/>
-        </w:rPr>
-        <w:t>Mark 9:4</w:t>
-      </w:r>
-      <w:r>
-        <w:rPr>
-          <w:lang w:val="en_US" w:bidi="en_US"/>
-        </w:rPr>
-      </w:r>
-    </w:p>
-    <w:p>
-      <w:pPr/>
-      <w:r>
-        <w:rPr>
-          <w:lang w:val="en_US" w:bidi="en_US"/>
-        </w:rPr>
-      </w:r>
-      <w:r>
-        <w:rPr>
-          <w:lang w:val="en_US" w:bidi="en_US"/>
-        </w:rPr>
-        <w:t xml:space="preserve">The appearance of Elijah and Moses might indicate the fulfillment of the law and the prophets in Jesus (see </w:t>
-      </w:r>
-      <w:hyperlink r:id="rId576">
-        <w:r>
-          <w:rPr>
-            <w:lang w:val="en_US" w:bidi="en_US"/>
-          </w:rPr>
-          <w:rPr>
-            <w:color w:val="0000EE"/>
-            <w:u w:val="single"/>
-          </w:rPr>
-          <w:t>Matthew 5:17</w:t>
-        </w:r>
-      </w:hyperlink>
-      <w:r>
-        <w:rPr>
-          <w:lang w:val="en_US" w:bidi="en_US"/>
-        </w:rPr>
-        <w:t xml:space="preserve">; compare </w:t>
-      </w:r>
-      <w:hyperlink r:id="rId577">
-        <w:r>
-          <w:rPr>
-            <w:lang w:val="en_US" w:bidi="en_US"/>
-          </w:rPr>
-          <w:rPr>
-            <w:color w:val="0000EE"/>
-            <w:u w:val="single"/>
-          </w:rPr>
-          <w:t>Malachi 4:4–5</w:t>
-        </w:r>
-      </w:hyperlink>
-      <w:r>
-        <w:rPr>
-          <w:lang w:val="en_US" w:bidi="en_US"/>
-        </w:rPr>
-        <w:t>).</w:t>
-      </w:r>
-      <w:r>
-        <w:rPr>
-          <w:lang w:val="en_US" w:bidi="en_US"/>
-        </w:rPr>
-      </w:r>
-      <w:r>
-        <w:rPr>
-          <w:lang w:val="en_US" w:bidi="en_US"/>
-        </w:rPr>
-      </w:r>
-    </w:p>
-    <w:p>
-      <w:pPr/>
-      <w:r>
-        <w:rPr>
-          <w:lang w:val="en_US" w:bidi="en_US"/>
-        </w:rPr>
-      </w:r>
-    </w:p>
-    <w:p>
-      <w:pPr>
-        <w:pStyle w:val="Heading2"/>
-      </w:pPr>
-      <w:r>
-        <w:rPr>
-          <w:lang w:val="en_US" w:bidi="en_US"/>
-        </w:rPr>
-        <w:t>Mark 9:5–6</w:t>
-      </w:r>
-      <w:r>
-        <w:rPr>
-          <w:lang w:val="en_US" w:bidi="en_US"/>
-        </w:rPr>
-      </w:r>
-    </w:p>
-    <w:p>
-      <w:pPr/>
-      <w:r>
-        <w:rPr>
-          <w:lang w:val="en_US" w:bidi="en_US"/>
-        </w:rPr>
-      </w:r>
-      <w:r>
-        <w:rPr>
-          <w:lang w:val="en_US" w:bidi="en_US"/>
-        </w:rPr>
-        <w:t xml:space="preserve">The idea to </w:t>
-      </w:r>
-      <w:r>
-        <w:rPr>
-          <w:i/>
-          <w:lang w:val="en_US" w:bidi="en_US"/>
-        </w:rPr>
-        <w:t>put up</w:t>
-      </w:r>
-      <w:r>
-        <w:rPr>
-          <w:lang w:val="en_US" w:bidi="en_US"/>
-        </w:rPr>
-        <w:t xml:space="preserve"> </w:t>
-      </w:r>
-      <w:r>
-        <w:rPr>
-          <w:i/>
-          <w:lang w:val="en_US" w:bidi="en_US"/>
-        </w:rPr>
-        <w:t>three shelters</w:t>
-      </w:r>
-      <w:r>
-        <w:rPr>
-          <w:lang w:val="en_US" w:bidi="en_US"/>
-        </w:rPr>
-        <w:t xml:space="preserve"> as memorials treats Moses, Elijah, and Jesus as equals (see </w:t>
-      </w:r>
-      <w:hyperlink r:id="rId578">
-        <w:r>
-          <w:rPr>
-            <w:lang w:val="en_US" w:bidi="en_US"/>
-          </w:rPr>
-          <w:rPr>
-            <w:color w:val="0000EE"/>
-            <w:u w:val="single"/>
-          </w:rPr>
-          <w:t>Leviticus 23:33–43</w:t>
-        </w:r>
-      </w:hyperlink>
-      <w:r>
-        <w:rPr>
-          <w:lang w:val="en_US" w:bidi="en_US"/>
-        </w:rPr>
-        <w:t xml:space="preserve">; </w:t>
-      </w:r>
-      <w:hyperlink r:id="rId579">
-        <w:r>
-          <w:rPr>
-            <w:lang w:val="en_US" w:bidi="en_US"/>
-          </w:rPr>
-          <w:rPr>
-            <w:color w:val="0000EE"/>
-            <w:u w:val="single"/>
-          </w:rPr>
-          <w:t>Numbers 29:12–34</w:t>
-        </w:r>
-      </w:hyperlink>
-      <w:r>
-        <w:rPr>
-          <w:lang w:val="en_US" w:bidi="en_US"/>
-        </w:rPr>
-        <w:t>). But this idea ignored Peter’s earlier confession that Jesus is the Messiah (</w:t>
-      </w:r>
-      <w:hyperlink r:id="rId535">
-        <w:r>
-          <w:rPr>
-            <w:lang w:val="en_US" w:bidi="en_US"/>
-          </w:rPr>
-          <w:rPr>
-            <w:color w:val="0000EE"/>
-            <w:u w:val="single"/>
-          </w:rPr>
-          <w:t>Mark 8:29</w:t>
-        </w:r>
-      </w:hyperlink>
-      <w:r>
-        <w:rPr>
-          <w:lang w:val="en_US" w:bidi="en_US"/>
-        </w:rPr>
-        <w:t xml:space="preserve">). It also ignored that only Jesus had been transfigured (his appearance changed and showed his glory, </w:t>
-      </w:r>
-      <w:hyperlink r:id="rId580">
-        <w:r>
-          <w:rPr>
-            <w:lang w:val="en_US" w:bidi="en_US"/>
-          </w:rPr>
-          <w:rPr>
-            <w:color w:val="0000EE"/>
-            <w:u w:val="single"/>
-          </w:rPr>
-          <w:t>9:2–3</w:t>
-        </w:r>
-      </w:hyperlink>
-      <w:r>
-        <w:rPr>
-          <w:lang w:val="en_US" w:bidi="en_US"/>
-        </w:rPr>
-        <w:t>).</w:t>
-      </w:r>
-      <w:r>
-        <w:rPr>
-          <w:lang w:val="en_US" w:bidi="en_US"/>
-        </w:rPr>
-      </w:r>
-      <w:r>
-        <w:rPr>
-          <w:lang w:val="en_US" w:bidi="en_US"/>
-        </w:rPr>
-      </w:r>
-    </w:p>
-    <w:p>
-      <w:pPr/>
-      <w:r>
-        <w:rPr>
-          <w:lang w:val="en_US" w:bidi="en_US"/>
-        </w:rPr>
-      </w:r>
-    </w:p>
-    <w:p>
-      <w:pPr>
-        <w:pStyle w:val="Heading2"/>
-      </w:pPr>
-      <w:r>
-        <w:rPr>
-          <w:lang w:val="en_US" w:bidi="en_US"/>
-        </w:rPr>
-        <w:t>Mark 9:7</w:t>
-      </w:r>
-      <w:r>
-        <w:rPr>
-          <w:lang w:val="en_US" w:bidi="en_US"/>
-        </w:rPr>
-      </w:r>
-    </w:p>
-    <w:p>
-      <w:pPr/>
-      <w:r>
-        <w:rPr>
-          <w:lang w:val="en_US" w:bidi="en_US"/>
-        </w:rPr>
-      </w:r>
-      <w:r>
-        <w:rPr>
-          <w:lang w:val="en_US" w:bidi="en_US"/>
-        </w:rPr>
-        <w:t xml:space="preserve">a cloud: Cp. </w:t>
-      </w:r>
-      <w:hyperlink r:id="rId581">
-        <w:r>
-          <w:rPr>
-            <w:lang w:val="en_US" w:bidi="en_US"/>
-          </w:rPr>
-          <w:rPr>
-            <w:color w:val="0000EE"/>
-            <w:u w:val="single"/>
-          </w:rPr>
-          <w:t>Exod 40:34–35</w:t>
-        </w:r>
-      </w:hyperlink>
-      <w:r>
-        <w:rPr>
-          <w:lang w:val="en_US" w:bidi="en_US"/>
-        </w:rPr>
-        <w:t>. • The voice from the cloud issued a stern rebuke of Peter’s suggestion: This is my dearly loved Son—not an equal of Moses and Elijah. God’s voice also confirmed Peter’s earlier confession (</w:t>
-      </w:r>
-      <w:hyperlink r:id="rId535">
-        <w:r>
-          <w:rPr>
-            <w:lang w:val="en_US" w:bidi="en_US"/>
-          </w:rPr>
-          <w:rPr>
-            <w:color w:val="0000EE"/>
-            <w:u w:val="single"/>
-          </w:rPr>
-          <w:t>Mark 8:29</w:t>
-        </w:r>
-      </w:hyperlink>
-      <w:r>
-        <w:rPr>
-          <w:lang w:val="en_US" w:bidi="en_US"/>
-        </w:rPr>
-        <w:t>), and it indirectly rebuked Peter for rejecting Jesus’ prediction of his suffering (</w:t>
-      </w:r>
-      <w:hyperlink r:id="rId582">
-        <w:r>
-          <w:rPr>
-            <w:lang w:val="en_US" w:bidi="en_US"/>
-          </w:rPr>
-          <w:rPr>
-            <w:color w:val="0000EE"/>
-            <w:u w:val="single"/>
-          </w:rPr>
-          <w:t>8:32</w:t>
-        </w:r>
-      </w:hyperlink>
-      <w:r>
-        <w:rPr>
-          <w:lang w:val="en_US" w:bidi="en_US"/>
-        </w:rPr>
-        <w:t>) by telling him and the other disciples to listen to him.</w:t>
-      </w:r>
-      <w:r>
-        <w:rPr>
-          <w:lang w:val="en_US" w:bidi="en_US"/>
-        </w:rPr>
-      </w:r>
-      <w:r>
-        <w:rPr>
-          <w:lang w:val="en_US" w:bidi="en_US"/>
-        </w:rPr>
-      </w:r>
-    </w:p>
-    <w:p>
-      <w:pPr/>
-      <w:r>
-        <w:rPr>
-          <w:lang w:val="en_US" w:bidi="en_US"/>
-        </w:rPr>
-      </w:r>
-    </w:p>
-    <w:p>
-      <w:pPr>
-        <w:pStyle w:val="Heading2"/>
-      </w:pPr>
-      <w:r>
-        <w:rPr>
-          <w:lang w:val="en_US" w:bidi="en_US"/>
-        </w:rPr>
-        <w:t>Mark 9:8</w:t>
-      </w:r>
-      <w:r>
-        <w:rPr>
-          <w:lang w:val="en_US" w:bidi="en_US"/>
-        </w:rPr>
-      </w:r>
-    </w:p>
-    <w:p>
-      <w:pPr/>
-      <w:r>
-        <w:rPr>
-          <w:lang w:val="en_US" w:bidi="en_US"/>
-        </w:rPr>
-      </w:r>
-      <w:r>
-        <w:rPr>
-          <w:lang w:val="en_US" w:bidi="en_US"/>
-        </w:rPr>
-        <w:t>Only Jesus remained, not Moses or Elijah. Jesus was clearly superior to Elijah and Moses.</w:t>
-      </w:r>
-      <w:r>
-        <w:rPr>
-          <w:lang w:val="en_US" w:bidi="en_US"/>
-        </w:rPr>
-      </w:r>
-      <w:r>
-        <w:rPr>
-          <w:lang w:val="en_US" w:bidi="en_US"/>
-        </w:rPr>
-      </w:r>
-    </w:p>
-    <w:p>
-      <w:pPr/>
-      <w:r>
-        <w:rPr>
-          <w:lang w:val="en_US" w:bidi="en_US"/>
-        </w:rPr>
-      </w:r>
-    </w:p>
-    <w:p>
-      <w:pPr>
-        <w:pStyle w:val="Heading2"/>
-      </w:pPr>
-      <w:r>
-        <w:rPr>
-          <w:lang w:val="en_US" w:bidi="en_US"/>
-        </w:rPr>
-        <w:t>Mark 9:9</w:t>
-      </w:r>
-      <w:r>
-        <w:rPr>
-          <w:lang w:val="en_US" w:bidi="en_US"/>
-        </w:rPr>
-      </w:r>
-    </w:p>
-    <w:p>
-      <w:pPr/>
-      <w:r>
-        <w:rPr>
-          <w:lang w:val="en_US" w:bidi="en_US"/>
-        </w:rPr>
-      </w:r>
-      <w:r>
-        <w:rPr>
-          <w:lang w:val="en_US" w:bidi="en_US"/>
-        </w:rPr>
-        <w:t>Secrecy would no longer be necessary after the Son of Man had risen from the dead</w:t>
-      </w:r>
-      <w:r>
-        <w:rPr>
-          <w:i/>
-          <w:lang w:val="en_US" w:bidi="en_US"/>
-        </w:rPr>
-        <w:t>,</w:t>
-      </w:r>
-      <w:r>
-        <w:rPr>
-          <w:lang w:val="en_US" w:bidi="en_US"/>
-        </w:rPr>
-        <w:t xml:space="preserve"> because Jesus the Messiah would then be clearly understood as apolitical and non-militaristic, so he could be proclaimed openly to all (see </w:t>
-      </w:r>
-      <w:hyperlink r:id="rId583">
-        <w:r>
-          <w:rPr>
-            <w:lang w:val="en_US" w:bidi="en_US"/>
-          </w:rPr>
-          <w:rPr>
-            <w:color w:val="0000EE"/>
-            <w:u w:val="single"/>
-          </w:rPr>
-          <w:t>Acts 2:36</w:t>
-        </w:r>
-      </w:hyperlink>
-      <w:r>
-        <w:rPr>
-          <w:lang w:val="en_US" w:bidi="en_US"/>
-        </w:rPr>
-        <w:t xml:space="preserve">; </w:t>
-      </w:r>
-      <w:hyperlink r:id="rId584">
-        <w:r>
-          <w:rPr>
-            <w:lang w:val="en_US" w:bidi="en_US"/>
-          </w:rPr>
-          <w:rPr>
-            <w:color w:val="0000EE"/>
-            <w:u w:val="single"/>
-          </w:rPr>
-          <w:t>3:6</w:t>
-        </w:r>
-      </w:hyperlink>
-      <w:r>
-        <w:rPr>
-          <w:lang w:val="en_US" w:bidi="en_US"/>
-        </w:rPr>
-        <w:t>).</w:t>
-      </w:r>
-      <w:r>
-        <w:rPr>
-          <w:lang w:val="en_US" w:bidi="en_US"/>
-        </w:rPr>
-      </w:r>
-      <w:r>
-        <w:rPr>
-          <w:lang w:val="en_US" w:bidi="en_US"/>
-        </w:rPr>
-      </w:r>
-    </w:p>
-    <w:p>
-      <w:pPr/>
-      <w:r>
-        <w:rPr>
-          <w:lang w:val="en_US" w:bidi="en_US"/>
-        </w:rPr>
-      </w:r>
-    </w:p>
-    <w:p>
-      <w:pPr>
-        <w:pStyle w:val="Heading2"/>
-      </w:pPr>
-      <w:r>
-        <w:rPr>
-          <w:lang w:val="en_US" w:bidi="en_US"/>
-        </w:rPr>
-        <w:t>Mark 9:10</w:t>
-      </w:r>
-      <w:r>
-        <w:rPr>
-          <w:lang w:val="en_US" w:bidi="en_US"/>
-        </w:rPr>
-      </w:r>
-    </w:p>
-    <w:p>
-      <w:pPr/>
-      <w:r>
-        <w:rPr>
-          <w:lang w:val="en_US" w:bidi="en_US"/>
-        </w:rPr>
-      </w:r>
-      <w:r>
-        <w:rPr>
-          <w:lang w:val="en_US" w:bidi="en_US"/>
-        </w:rPr>
-        <w:t xml:space="preserve">The three disciples only understood what Jesus meant by </w:t>
-      </w:r>
-      <w:r>
-        <w:rPr>
-          <w:i/>
-          <w:lang w:val="en_US" w:bidi="en_US"/>
-        </w:rPr>
-        <w:t>rise from the dead</w:t>
-      </w:r>
-      <w:r>
-        <w:rPr>
-          <w:lang w:val="en_US" w:bidi="en_US"/>
-        </w:rPr>
-        <w:t xml:space="preserve"> after it happened.</w:t>
-      </w:r>
-      <w:r>
-        <w:rPr>
-          <w:lang w:val="en_US" w:bidi="en_US"/>
-        </w:rPr>
-      </w:r>
-      <w:r>
-        <w:rPr>
-          <w:lang w:val="en_US" w:bidi="en_US"/>
-        </w:rPr>
-      </w:r>
-    </w:p>
-    <w:p>
-      <w:pPr/>
-      <w:r>
-        <w:rPr>
-          <w:lang w:val="en_US" w:bidi="en_US"/>
-        </w:rPr>
-      </w:r>
-    </w:p>
-    <w:p>
-      <w:pPr>
-        <w:pStyle w:val="Heading2"/>
-      </w:pPr>
-      <w:r>
-        <w:rPr>
-          <w:lang w:val="en_US" w:bidi="en_US"/>
-        </w:rPr>
-        <w:t>Mark 9:11</w:t>
-      </w:r>
-      <w:r>
-        <w:rPr>
-          <w:lang w:val="en_US" w:bidi="en_US"/>
-        </w:rPr>
-      </w:r>
-    </w:p>
-    <w:p>
-      <w:pPr/>
-      <w:r>
-        <w:rPr>
-          <w:lang w:val="en_US" w:bidi="en_US"/>
-        </w:rPr>
-      </w:r>
-      <w:r>
-        <w:rPr>
-          <w:lang w:val="en_US" w:bidi="en_US"/>
-        </w:rPr>
-        <w:t xml:space="preserve">The disciples wanted to understand the prediction that Elijah must return before the Messiah comes (see </w:t>
-      </w:r>
-      <w:hyperlink r:id="rId398">
-        <w:r>
-          <w:rPr>
-            <w:lang w:val="en_US" w:bidi="en_US"/>
-          </w:rPr>
-          <w:rPr>
-            <w:color w:val="0000EE"/>
-            <w:u w:val="single"/>
-          </w:rPr>
-          <w:t>Mal 4:5–6</w:t>
-        </w:r>
-      </w:hyperlink>
-      <w:r>
-        <w:rPr>
-          <w:lang w:val="en_US" w:bidi="en_US"/>
-        </w:rPr>
-        <w:t>). How did this prediction fit with Jesus’ proclamation of God’s Kingdom and his prediction of his own death, resurrection, and return (</w:t>
-      </w:r>
-      <w:hyperlink r:id="rId397">
-        <w:r>
-          <w:rPr>
-            <w:lang w:val="en_US" w:bidi="en_US"/>
-          </w:rPr>
-          <w:rPr>
-            <w:color w:val="0000EE"/>
-            <w:u w:val="single"/>
-          </w:rPr>
-          <w:t>Mark 8:31</w:t>
-        </w:r>
-      </w:hyperlink>
-      <w:r>
-        <w:rPr>
-          <w:lang w:val="en_US" w:bidi="en_US"/>
-        </w:rPr>
-        <w:t xml:space="preserve">, </w:t>
-      </w:r>
-      <w:hyperlink r:id="rId524">
-        <w:r>
-          <w:rPr>
-            <w:lang w:val="en_US" w:bidi="en_US"/>
-          </w:rPr>
-          <w:rPr>
-            <w:color w:val="0000EE"/>
-            <w:u w:val="single"/>
-          </w:rPr>
-          <w:t>38</w:t>
-        </w:r>
-      </w:hyperlink>
-      <w:r>
-        <w:rPr>
-          <w:lang w:val="en_US" w:bidi="en_US"/>
-        </w:rPr>
-        <w:t xml:space="preserve">; </w:t>
-      </w:r>
-      <w:hyperlink r:id="rId134">
-        <w:r>
-          <w:rPr>
-            <w:lang w:val="en_US" w:bidi="en_US"/>
-          </w:rPr>
-          <w:rPr>
-            <w:color w:val="0000EE"/>
-            <w:u w:val="single"/>
-          </w:rPr>
-          <w:t>9:9</w:t>
-        </w:r>
-      </w:hyperlink>
-      <w:r>
-        <w:rPr>
-          <w:lang w:val="en_US" w:bidi="en_US"/>
-        </w:rPr>
-        <w:t>)?</w:t>
-      </w:r>
-      <w:r>
-        <w:rPr>
-          <w:lang w:val="en_US" w:bidi="en_US"/>
-        </w:rPr>
-      </w:r>
-      <w:r>
-        <w:rPr>
-          <w:lang w:val="en_US" w:bidi="en_US"/>
-        </w:rPr>
-      </w:r>
-    </w:p>
-    <w:p>
-      <w:pPr/>
-      <w:r>
-        <w:rPr>
-          <w:lang w:val="en_US" w:bidi="en_US"/>
-        </w:rPr>
-      </w:r>
-    </w:p>
-    <w:p>
-      <w:pPr>
-        <w:pStyle w:val="Heading2"/>
-      </w:pPr>
-      <w:r>
-        <w:rPr>
-          <w:lang w:val="en_US" w:bidi="en_US"/>
-        </w:rPr>
-        <w:t>Mark 9:12</w:t>
-      </w:r>
-      <w:r>
-        <w:rPr>
-          <w:lang w:val="en_US" w:bidi="en_US"/>
-        </w:rPr>
-      </w:r>
-    </w:p>
-    <w:p>
-      <w:pPr/>
-      <w:r>
-        <w:rPr>
-          <w:lang w:val="en_US" w:bidi="en_US"/>
-        </w:rPr>
-      </w:r>
-      <w:r>
-        <w:rPr>
-          <w:lang w:val="en_US" w:bidi="en_US"/>
-        </w:rPr>
-        <w:t xml:space="preserve">The teachers of the law were correct: Elijah must return before the consummation of God’s Kingdom, but Scripture also said that the Son of Man would suffer greatly (e.g., </w:t>
-      </w:r>
-      <w:hyperlink r:id="rId585">
-        <w:r>
-          <w:rPr>
-            <w:lang w:val="en_US" w:bidi="en_US"/>
-          </w:rPr>
-          <w:rPr>
-            <w:color w:val="0000EE"/>
-            <w:u w:val="single"/>
-          </w:rPr>
-          <w:t>Ps 22</w:t>
-        </w:r>
-      </w:hyperlink>
-      <w:r>
-        <w:rPr>
-          <w:lang w:val="en_US" w:bidi="en_US"/>
-        </w:rPr>
-        <w:t xml:space="preserve">; </w:t>
-      </w:r>
-      <w:hyperlink r:id="rId586">
-        <w:r>
-          <w:rPr>
-            <w:lang w:val="en_US" w:bidi="en_US"/>
-          </w:rPr>
-          <w:rPr>
-            <w:color w:val="0000EE"/>
-            <w:u w:val="single"/>
-          </w:rPr>
-          <w:t>Isa 52:13–53:12</w:t>
-        </w:r>
-      </w:hyperlink>
-      <w:r>
-        <w:rPr>
-          <w:lang w:val="en_US" w:bidi="en_US"/>
-        </w:rPr>
-        <w:t>).</w:t>
-      </w:r>
-      <w:r>
-        <w:rPr>
-          <w:lang w:val="en_US" w:bidi="en_US"/>
-        </w:rPr>
-      </w:r>
-      <w:r>
-        <w:rPr>
-          <w:lang w:val="en_US" w:bidi="en_US"/>
-        </w:rPr>
-      </w:r>
-    </w:p>
-    <w:p>
-      <w:pPr/>
-      <w:r>
-        <w:rPr>
-          <w:lang w:val="en_US" w:bidi="en_US"/>
-        </w:rPr>
-      </w:r>
-    </w:p>
-    <w:p>
-      <w:pPr>
-        <w:pStyle w:val="Heading2"/>
-      </w:pPr>
-      <w:r>
-        <w:rPr>
-          <w:lang w:val="en_US" w:bidi="en_US"/>
-        </w:rPr>
-        <w:t>Mark 9:13</w:t>
-      </w:r>
-      <w:r>
-        <w:rPr>
-          <w:lang w:val="en_US" w:bidi="en_US"/>
-        </w:rPr>
-      </w:r>
-    </w:p>
-    <w:p>
-      <w:pPr/>
-      <w:r>
-        <w:rPr>
-          <w:lang w:val="en_US" w:bidi="en_US"/>
-        </w:rPr>
-      </w:r>
-      <w:r>
-        <w:rPr>
-          <w:lang w:val="en_US" w:bidi="en_US"/>
-        </w:rPr>
-        <w:t xml:space="preserve">The teachers of the law erred by not realizing that Elijah had already come (see </w:t>
-      </w:r>
-      <w:hyperlink r:id="rId587">
-        <w:r>
-          <w:rPr>
-            <w:lang w:val="en_US" w:bidi="en_US"/>
-          </w:rPr>
-          <w:rPr>
-            <w:color w:val="0000EE"/>
-            <w:u w:val="single"/>
-          </w:rPr>
-          <w:t>Matt 17:11–13</w:t>
-        </w:r>
-      </w:hyperlink>
-      <w:r>
-        <w:rPr>
-          <w:lang w:val="en_US" w:bidi="en_US"/>
-        </w:rPr>
-        <w:t xml:space="preserve">; cp. </w:t>
-      </w:r>
-      <w:hyperlink r:id="rId398">
-        <w:r>
-          <w:rPr>
-            <w:lang w:val="en_US" w:bidi="en_US"/>
-          </w:rPr>
-          <w:rPr>
-            <w:color w:val="0000EE"/>
-            <w:u w:val="single"/>
-          </w:rPr>
-          <w:t>Mal 4:5–6</w:t>
-        </w:r>
-      </w:hyperlink>
-      <w:r>
-        <w:rPr>
-          <w:lang w:val="en_US" w:bidi="en_US"/>
-        </w:rPr>
-        <w:t>). As a result, they failed to recognize that the Kingdom of God had already come and that the Messiah’s suffering and death that were predicted in Scripture were about to take place.</w:t>
-      </w:r>
-      <w:r>
-        <w:rPr>
-          <w:lang w:val="en_US" w:bidi="en_US"/>
-        </w:rPr>
-      </w:r>
-      <w:r>
-        <w:rPr>
-          <w:lang w:val="en_US" w:bidi="en_US"/>
-        </w:rPr>
-      </w:r>
-    </w:p>
-    <w:p>
-      <w:pPr/>
-      <w:r>
-        <w:rPr>
-          <w:lang w:val="en_US" w:bidi="en_US"/>
-        </w:rPr>
-      </w:r>
-    </w:p>
-    <w:p>
-      <w:pPr>
-        <w:pStyle w:val="Heading2"/>
-      </w:pPr>
-      <w:r>
-        <w:rPr>
-          <w:lang w:val="en_US" w:bidi="en_US"/>
-        </w:rPr>
-        <w:t>Mark 9:14</w:t>
-      </w:r>
-      <w:r>
-        <w:rPr>
-          <w:lang w:val="en_US" w:bidi="en_US"/>
-        </w:rPr>
-      </w:r>
-    </w:p>
-    <w:p>
-      <w:pPr/>
-      <w:r>
-        <w:rPr>
-          <w:lang w:val="en_US" w:bidi="en_US"/>
-        </w:rPr>
-      </w:r>
-      <w:r>
-        <w:rPr>
-          <w:lang w:val="en_US" w:bidi="en_US"/>
-        </w:rPr>
-        <w:t>Jesus and the three disciples (Peter, James, and John) rejoined the other disciples, the crowd, and the teachers of the law. This account is similar to the story of Moses descending from Mount Sinai to rejoin the people of Israel (</w:t>
-      </w:r>
-      <w:hyperlink r:id="rId588">
-        <w:r>
-          <w:rPr>
-            <w:lang w:val="en_US" w:bidi="en_US"/>
-          </w:rPr>
-          <w:rPr>
-            <w:color w:val="0000EE"/>
-            <w:u w:val="single"/>
-          </w:rPr>
-          <w:t>Exod 34:29–35</w:t>
-        </w:r>
-      </w:hyperlink>
-      <w:r>
-        <w:rPr>
-          <w:lang w:val="en_US" w:bidi="en_US"/>
-        </w:rPr>
-        <w:t>).</w:t>
-      </w:r>
-      <w:r>
-        <w:rPr>
-          <w:lang w:val="en_US" w:bidi="en_US"/>
-        </w:rPr>
-      </w:r>
-      <w:r>
-        <w:rPr>
-          <w:lang w:val="en_US" w:bidi="en_US"/>
-        </w:rPr>
-      </w:r>
-    </w:p>
-    <w:p>
-      <w:pPr/>
-      <w:r>
-        <w:rPr>
-          <w:lang w:val="en_US" w:bidi="en_US"/>
-        </w:rPr>
-      </w:r>
-    </w:p>
-    <w:p>
-      <w:pPr>
-        <w:pStyle w:val="Heading2"/>
-      </w:pPr>
-      <w:r>
-        <w:rPr>
-          <w:lang w:val="en_US" w:bidi="en_US"/>
-        </w:rPr>
-        <w:t>Mark 9:14–29</w:t>
-      </w:r>
-      <w:r>
-        <w:rPr>
-          <w:lang w:val="en_US" w:bidi="en_US"/>
-        </w:rPr>
-      </w:r>
-    </w:p>
-    <w:p>
-      <w:pPr/>
-      <w:r>
-        <w:rPr>
-          <w:lang w:val="en_US" w:bidi="en_US"/>
-        </w:rPr>
-      </w:r>
-      <w:r>
-        <w:rPr>
-          <w:lang w:val="en_US" w:bidi="en_US"/>
-        </w:rPr>
-        <w:t>This is the fourth and last exorcism in Mark (</w:t>
-      </w:r>
-      <w:hyperlink r:id="rId345">
-        <w:r>
-          <w:rPr>
-            <w:lang w:val="en_US" w:bidi="en_US"/>
-          </w:rPr>
-          <w:rPr>
-            <w:color w:val="0000EE"/>
-            <w:u w:val="single"/>
-          </w:rPr>
-          <w:t>1:21–28</w:t>
-        </w:r>
-      </w:hyperlink>
-      <w:r>
-        <w:rPr>
-          <w:lang w:val="en_US" w:bidi="en_US"/>
-        </w:rPr>
-        <w:t xml:space="preserve">; </w:t>
-      </w:r>
-      <w:hyperlink r:id="rId76">
-        <w:r>
-          <w:rPr>
-            <w:lang w:val="en_US" w:bidi="en_US"/>
-          </w:rPr>
-          <w:rPr>
-            <w:color w:val="0000EE"/>
-            <w:u w:val="single"/>
-          </w:rPr>
-          <w:t>5:1–20</w:t>
-        </w:r>
-      </w:hyperlink>
-      <w:r>
-        <w:rPr>
-          <w:lang w:val="en_US" w:bidi="en_US"/>
-        </w:rPr>
-        <w:t xml:space="preserve">; </w:t>
-      </w:r>
-      <w:hyperlink r:id="rId112">
-        <w:r>
-          <w:rPr>
-            <w:lang w:val="en_US" w:bidi="en_US"/>
-          </w:rPr>
-          <w:rPr>
-            <w:color w:val="0000EE"/>
-            <w:u w:val="single"/>
-          </w:rPr>
-          <w:t>7:24–30</w:t>
-        </w:r>
-      </w:hyperlink>
-      <w:r>
-        <w:rPr>
-          <w:lang w:val="en_US" w:bidi="en_US"/>
-        </w:rPr>
-        <w:t xml:space="preserve">). The disciples were unable to perform the exorcism, so Jesus performed it, emphasizing the necessity of faith (cp. </w:t>
-      </w:r>
-      <w:hyperlink r:id="rId375">
-        <w:r>
-          <w:rPr>
-            <w:lang w:val="en_US" w:bidi="en_US"/>
-          </w:rPr>
-          <w:rPr>
-            <w:color w:val="0000EE"/>
-            <w:u w:val="single"/>
-          </w:rPr>
-          <w:t>2:5</w:t>
-        </w:r>
-      </w:hyperlink>
-      <w:r>
-        <w:rPr>
-          <w:lang w:val="en_US" w:bidi="en_US"/>
-        </w:rPr>
-        <w:t xml:space="preserve">; </w:t>
-      </w:r>
-      <w:hyperlink r:id="rId352">
-        <w:r>
-          <w:rPr>
-            <w:lang w:val="en_US" w:bidi="en_US"/>
-          </w:rPr>
-          <w:rPr>
-            <w:color w:val="0000EE"/>
-            <w:u w:val="single"/>
-          </w:rPr>
-          <w:t>5:34</w:t>
-        </w:r>
-      </w:hyperlink>
-      <w:r>
-        <w:rPr>
-          <w:lang w:val="en_US" w:bidi="en_US"/>
-        </w:rPr>
-        <w:t xml:space="preserve">; </w:t>
-      </w:r>
       <w:hyperlink r:id="rId358">
         <w:r>
           <w:rPr>
@@ -29320,7 +29660,7 @@
         <w:rPr>
           <w:lang w:val="en_US" w:bidi="en_US"/>
         </w:rPr>
-        <w:t>). This is another example of Jesus’ great healing ability and of the disciples’ failure (</w:t>
+        <w:t>). This is another example of the great healing ability of Jesus and of the failure of the disciples (</w:t>
       </w:r>
       <w:hyperlink r:id="rId543">
         <w:r>

</xml_diff>